<commit_message>
Updated compose file to remove unnecessary EV charger/monorail Wordpress containers and adjusted local port numbers to be more intuitive. Also adjusted setup script to make the project folder, removing any room for human error in the naming of it, and applied the changes Zane suggested in the change request.
</commit_message>
<xml_diff>
--- a/Backend/VM Setup/VM Setup Guide.docx
+++ b/Backend/VM Setup/VM Setup Guide.docx
@@ -257,7 +257,38 @@
         <w:rPr>
           <w:rtl w:val="0"/>
         </w:rPr>
-        <w:t xml:space="preserve">Create a project folder called “GamifiedICS” on the desktop (GUI or command line).</w:t>
+        <w:t xml:space="preserve">Paste the contents of the “</w:t>
+      </w:r>
+      <w:r>
+        <w:rPr>
+          <w:b w:val="1"/>
+          <w:rtl w:val="0"/>
+        </w:rPr>
+        <w:t xml:space="preserve">VM Setup</w:t>
+      </w:r>
+      <w:r>
+        <w:rPr>
+          <w:rtl w:val="0"/>
+        </w:rPr>
+        <w:t xml:space="preserve">” folder onto the desktop.</w:t>
+      </w:r>
+    </w:p>
+    <w:p>
+      <w:pPr>
+        <w:numPr>
+          <w:ilvl w:val="0"/>
+          <w:numId w:val="1"/>
+        </w:numPr>
+        <w:ind w:left="720" w:hanging="360"/>
+        <w:rPr>
+          <w:u w:val="none"/>
+        </w:rPr>
+      </w:pPr>
+      <w:r>
+        <w:rPr>
+          <w:rtl w:val="0"/>
+        </w:rPr>
+        <w:t xml:space="preserve">Now run the following 3 commands:</w:t>
       </w:r>
     </w:p>
     <w:p>
@@ -268,119 +299,20 @@
         </w:numPr>
         <w:ind w:left="1440" w:hanging="360"/>
         <w:rPr>
-          <w:u w:val="none"/>
-        </w:rPr>
-      </w:pPr>
-      <w:r>
-        <w:rPr>
-          <w:rtl w:val="0"/>
-        </w:rPr>
-        <w:t xml:space="preserve">Make sure there’s no space and correct capitalization.</w:t>
-      </w:r>
-    </w:p>
-    <w:p>
-      <w:pPr>
-        <w:numPr>
-          <w:ilvl w:val="0"/>
-          <w:numId w:val="1"/>
-        </w:numPr>
-        <w:ind w:left="720" w:hanging="360"/>
-      </w:pPr>
-      <w:r>
-        <w:rPr>
-          <w:rtl w:val="0"/>
-        </w:rPr>
-        <w:t xml:space="preserve">Paste the contents of the “</w:t>
-      </w:r>
-      <w:r>
-        <w:rPr>
-          <w:b w:val="1"/>
-          <w:rtl w:val="0"/>
-        </w:rPr>
-        <w:t xml:space="preserve">VM Setup</w:t>
-      </w:r>
-      <w:r>
-        <w:rPr>
-          <w:rtl w:val="0"/>
-        </w:rPr>
-        <w:t xml:space="preserve">” folder into </w:t>
-      </w:r>
-      <w:r>
-        <w:rPr>
-          <w:rtl w:val="0"/>
-        </w:rPr>
-        <w:t xml:space="preserve">it.</w:t>
-      </w:r>
-    </w:p>
-    <w:p>
-      <w:pPr>
-        <w:numPr>
-          <w:ilvl w:val="1"/>
-          <w:numId w:val="1"/>
-        </w:numPr>
-        <w:ind w:left="1440" w:hanging="360"/>
-        <w:rPr>
-          <w:u w:val="none"/>
-        </w:rPr>
-      </w:pPr>
-      <w:r>
-        <w:rPr>
-          <w:rtl w:val="0"/>
-        </w:rPr>
-        <w:t xml:space="preserve">If you get a “permission denied” error, run “sudo chown -R kali:kali /Desktop/GamifiedICS” in the terminal.</w:t>
-      </w:r>
-    </w:p>
-    <w:p>
-      <w:pPr>
-        <w:numPr>
-          <w:ilvl w:val="0"/>
-          <w:numId w:val="1"/>
-        </w:numPr>
-        <w:ind w:left="720" w:hanging="360"/>
-        <w:rPr>
-          <w:u w:val="none"/>
-        </w:rPr>
-      </w:pPr>
-      <w:r>
-        <w:rPr>
-          <w:rtl w:val="0"/>
-        </w:rPr>
-        <w:t xml:space="preserve">Now run the following 3 commands:</w:t>
-      </w:r>
-    </w:p>
-    <w:p>
-      <w:pPr>
-        <w:numPr>
-          <w:ilvl w:val="1"/>
-          <w:numId w:val="1"/>
-        </w:numPr>
-        <w:ind w:left="1440" w:hanging="360"/>
-        <w:rPr>
-          <w:b w:val="1"/>
-        </w:rPr>
-      </w:pPr>
-      <w:r>
-        <w:rPr>
-          <w:b w:val="1"/>
-          <w:rtl w:val="0"/>
-        </w:rPr>
-        <w:t xml:space="preserve">cd Desktop/GamifiedICS</w:t>
-      </w:r>
-    </w:p>
-    <w:p>
-      <w:pPr>
-        <w:numPr>
-          <w:ilvl w:val="2"/>
-          <w:numId w:val="1"/>
-        </w:numPr>
-        <w:ind w:left="2160" w:hanging="360"/>
-        <w:rPr/>
-      </w:pPr>
-      <w:r>
-        <w:rPr>
-          <w:rtl w:val="0"/>
-        </w:rPr>
-        <w:t xml:space="preserve">If it says it doesn’t exist, just run “cd GamifiedICS”.</w:t>
+          <w:b w:val="1"/>
+        </w:rPr>
+      </w:pPr>
+      <w:r>
+        <w:rPr>
+          <w:b w:val="1"/>
+          <w:rtl w:val="0"/>
+        </w:rPr>
+        <w:t xml:space="preserve">cd Desktop</w:t>
+      </w:r>
+      <w:r>
+        <w:rPr>
+          <w:rtl w:val="0"/>
+        </w:rPr>
       </w:r>
     </w:p>
     <w:p>
@@ -468,6 +400,28 @@
     </w:p>
     <w:p>
       <w:pPr>
+        <w:ind w:left="0" w:firstLine="0"/>
+        <w:rPr/>
+      </w:pPr>
+      <w:r>
+        <w:rPr>
+          <w:rtl w:val="0"/>
+        </w:rPr>
+      </w:r>
+    </w:p>
+    <w:p>
+      <w:pPr>
+        <w:ind w:left="0" w:firstLine="0"/>
+        <w:rPr/>
+      </w:pPr>
+      <w:r>
+        <w:rPr>
+          <w:rtl w:val="0"/>
+        </w:rPr>
+      </w:r>
+    </w:p>
+    <w:p>
+      <w:pPr>
         <w:numPr>
           <w:ilvl w:val="0"/>
           <w:numId w:val="1"/>
@@ -544,13 +498,13 @@
           <w:b w:val="1"/>
           <w:rtl w:val="0"/>
         </w:rPr>
-        <w:t xml:space="preserve">EV Charger</w:t>
-      </w:r>
-      <w:r>
-        <w:rPr>
-          <w:rtl w:val="0"/>
-        </w:rPr>
-        <w:t xml:space="preserve">: [IP of VM]:8000/wp-admin</w:t>
+        <w:t xml:space="preserve">Power Plant</w:t>
+      </w:r>
+      <w:r>
+        <w:rPr>
+          <w:rtl w:val="0"/>
+        </w:rPr>
+        <w:t xml:space="preserve">: [IP of VM]:8002/wp-admin</w:t>
       </w:r>
     </w:p>
     <w:p>
@@ -589,34 +543,48 @@
           <w:u w:val="single"/>
           <w:rtl w:val="0"/>
         </w:rPr>
-        <w:t xml:space="preserve">!MTixTnKZWeR0pI1xF</w:t>
-      </w:r>
-      <w:r>
-        <w:rPr>
-          <w:rtl w:val="0"/>
-        </w:rPr>
-      </w:r>
-    </w:p>
-    <w:p>
-      <w:pPr>
-        <w:numPr>
-          <w:ilvl w:val="2"/>
-          <w:numId w:val="1"/>
-        </w:numPr>
-        <w:ind w:left="2160" w:hanging="360"/>
-      </w:pPr>
-      <w:r>
-        <w:rPr>
-          <w:b w:val="1"/>
-          <w:rtl w:val="0"/>
-        </w:rPr>
-        <w:t xml:space="preserve">Monorail</w:t>
-      </w:r>
-      <w:r>
-        <w:rPr>
-          <w:rtl w:val="0"/>
-        </w:rPr>
-        <w:t xml:space="preserve">: [IP of VM]:8001/wp-admin</w:t>
+        <w:t xml:space="preserve">HuPqEpb%qC#^Z7qyai</w:t>
+      </w:r>
+    </w:p>
+    <w:p>
+      <w:pPr>
+        <w:numPr>
+          <w:ilvl w:val="1"/>
+          <w:numId w:val="1"/>
+        </w:numPr>
+        <w:ind w:left="1440" w:hanging="360"/>
+        <w:rPr>
+          <w:b w:val="1"/>
+        </w:rPr>
+      </w:pPr>
+      <w:r>
+        <w:rPr>
+          <w:b w:val="1"/>
+          <w:rtl w:val="0"/>
+        </w:rPr>
+        <w:t xml:space="preserve">OpenPLC:</w:t>
+      </w:r>
+    </w:p>
+    <w:p>
+      <w:pPr>
+        <w:numPr>
+          <w:ilvl w:val="2"/>
+          <w:numId w:val="1"/>
+        </w:numPr>
+        <w:ind w:left="2160" w:hanging="360"/>
+      </w:pPr>
+      <w:r>
+        <w:rPr>
+          <w:b w:val="1"/>
+          <w:rtl w:val="0"/>
+        </w:rPr>
+        <w:t xml:space="preserve">EV Charger</w:t>
+      </w:r>
+      <w:r>
+        <w:rPr>
+          <w:rtl w:val="0"/>
+        </w:rPr>
+        <w:t xml:space="preserve">:</w:t>
       </w:r>
     </w:p>
     <w:p>
@@ -626,12 +594,62 @@
           <w:numId w:val="1"/>
         </w:numPr>
         <w:ind w:left="2880" w:hanging="360"/>
-      </w:pPr>
-      <w:r>
-        <w:rPr>
-          <w:rtl w:val="0"/>
-        </w:rPr>
-        <w:t xml:space="preserve">username </w:t>
+        <w:rPr>
+          <w:b w:val="1"/>
+        </w:rPr>
+      </w:pPr>
+      <w:r>
+        <w:rPr>
+          <w:b w:val="1"/>
+          <w:rtl w:val="0"/>
+        </w:rPr>
+        <w:t xml:space="preserve">Inverter:</w:t>
+      </w:r>
+      <w:r>
+        <w:rPr>
+          <w:rtl w:val="0"/>
+        </w:rPr>
+        <w:t xml:space="preserve"> [IP of VM]:8010</w:t>
+      </w:r>
+    </w:p>
+    <w:p>
+      <w:pPr>
+        <w:numPr>
+          <w:ilvl w:val="3"/>
+          <w:numId w:val="1"/>
+        </w:numPr>
+        <w:ind w:left="2880" w:hanging="360"/>
+        <w:rPr>
+          <w:b w:val="1"/>
+        </w:rPr>
+      </w:pPr>
+      <w:r>
+        <w:rPr>
+          <w:b w:val="1"/>
+          <w:rtl w:val="0"/>
+        </w:rPr>
+        <w:t xml:space="preserve">Communications:</w:t>
+      </w:r>
+      <w:r>
+        <w:rPr>
+          <w:rtl w:val="0"/>
+        </w:rPr>
+        <w:t xml:space="preserve"> [IP of VM]:8011</w:t>
+      </w:r>
+    </w:p>
+    <w:p>
+      <w:pPr>
+        <w:numPr>
+          <w:ilvl w:val="3"/>
+          <w:numId w:val="1"/>
+        </w:numPr>
+        <w:ind w:left="2880" w:hanging="360"/>
+      </w:pPr>
+      <w:r>
+        <w:rPr>
+          <w:rtl w:val="0"/>
+        </w:rPr>
+        <w:t xml:space="preserve">username and password: </w:t>
       </w:r>
       <w:r>
         <w:rPr>
@@ -640,13 +658,69 @@
           <w:u w:val="single"/>
           <w:rtl w:val="0"/>
         </w:rPr>
-        <w:t xml:space="preserve">user</w:t>
-      </w:r>
-      <w:r>
-        <w:rPr>
-          <w:rtl w:val="0"/>
-        </w:rPr>
-        <w:t xml:space="preserve">, password </w:t>
+        <w:t xml:space="preserve">openplc</w:t>
+      </w:r>
+    </w:p>
+    <w:p>
+      <w:pPr>
+        <w:numPr>
+          <w:ilvl w:val="2"/>
+          <w:numId w:val="1"/>
+        </w:numPr>
+        <w:ind w:left="2160" w:hanging="360"/>
+      </w:pPr>
+      <w:r>
+        <w:rPr>
+          <w:b w:val="1"/>
+          <w:rtl w:val="0"/>
+        </w:rPr>
+        <w:t xml:space="preserve">Monorail</w:t>
+      </w:r>
+      <w:r>
+        <w:rPr>
+          <w:rtl w:val="0"/>
+        </w:rPr>
+        <w:t xml:space="preserve">:</w:t>
+      </w:r>
+    </w:p>
+    <w:p>
+      <w:pPr>
+        <w:numPr>
+          <w:ilvl w:val="3"/>
+          <w:numId w:val="1"/>
+        </w:numPr>
+        <w:ind w:left="2880" w:hanging="360"/>
+        <w:rPr>
+          <w:b w:val="1"/>
+        </w:rPr>
+      </w:pPr>
+      <w:r>
+        <w:rPr>
+          <w:b w:val="1"/>
+          <w:rtl w:val="0"/>
+        </w:rPr>
+        <w:t xml:space="preserve">Placeholder:</w:t>
+      </w:r>
+      <w:r>
+        <w:rPr>
+          <w:rtl w:val="0"/>
+        </w:rPr>
+        <w:t xml:space="preserve"> [IP of VM]:8020</w:t>
+      </w:r>
+    </w:p>
+    <w:p>
+      <w:pPr>
+        <w:numPr>
+          <w:ilvl w:val="3"/>
+          <w:numId w:val="1"/>
+        </w:numPr>
+        <w:ind w:left="2880" w:hanging="360"/>
+      </w:pPr>
+      <w:r>
+        <w:rPr>
+          <w:rtl w:val="0"/>
+        </w:rPr>
+        <w:t xml:space="preserve">username and password: </w:t>
       </w:r>
       <w:r>
         <w:rPr>
@@ -655,7 +729,7 @@
           <w:u w:val="single"/>
           <w:rtl w:val="0"/>
         </w:rPr>
-        <w:t xml:space="preserve">5YNNqPB3&amp;vYiEWq&amp;8o</w:t>
+        <w:t xml:space="preserve">openplc</w:t>
       </w:r>
       <w:r>
         <w:rPr>
@@ -682,7 +756,7 @@
         <w:rPr>
           <w:rtl w:val="0"/>
         </w:rPr>
-        <w:t xml:space="preserve">: [IP of VM]:8002/wp-admin</w:t>
+        <w:t xml:space="preserve">:</w:t>
       </w:r>
     </w:p>
     <w:p>
@@ -692,12 +766,141 @@
           <w:numId w:val="1"/>
         </w:numPr>
         <w:ind w:left="2880" w:hanging="360"/>
-      </w:pPr>
-      <w:r>
-        <w:rPr>
-          <w:rtl w:val="0"/>
-        </w:rPr>
-        <w:t xml:space="preserve">username </w:t>
+        <w:rPr>
+          <w:b w:val="1"/>
+        </w:rPr>
+      </w:pPr>
+      <w:r>
+        <w:rPr>
+          <w:b w:val="1"/>
+          <w:rtl w:val="0"/>
+        </w:rPr>
+        <w:t xml:space="preserve">Cooling pump:</w:t>
+      </w:r>
+      <w:r>
+        <w:rPr>
+          <w:rtl w:val="0"/>
+        </w:rPr>
+        <w:t xml:space="preserve"> [IP of VM]:8030</w:t>
+      </w:r>
+    </w:p>
+    <w:p>
+      <w:pPr>
+        <w:numPr>
+          <w:ilvl w:val="3"/>
+          <w:numId w:val="1"/>
+        </w:numPr>
+        <w:ind w:left="2880" w:hanging="360"/>
+        <w:rPr>
+          <w:b w:val="1"/>
+          <w:u w:val="none"/>
+        </w:rPr>
+      </w:pPr>
+      <w:r>
+        <w:rPr>
+          <w:b w:val="1"/>
+          <w:rtl w:val="0"/>
+        </w:rPr>
+        <w:t xml:space="preserve">Geiger counter:</w:t>
+      </w:r>
+      <w:r>
+        <w:rPr>
+          <w:rtl w:val="0"/>
+        </w:rPr>
+        <w:t xml:space="preserve"> [IP of VM]:8031</w:t>
+      </w:r>
+    </w:p>
+    <w:p>
+      <w:pPr>
+        <w:numPr>
+          <w:ilvl w:val="3"/>
+          <w:numId w:val="1"/>
+        </w:numPr>
+        <w:ind w:left="2880" w:hanging="360"/>
+        <w:rPr>
+          <w:b w:val="1"/>
+          <w:u w:val="none"/>
+        </w:rPr>
+      </w:pPr>
+      <w:r>
+        <w:rPr>
+          <w:b w:val="1"/>
+          <w:rtl w:val="0"/>
+        </w:rPr>
+        <w:t xml:space="preserve">Heat sensor:</w:t>
+      </w:r>
+      <w:r>
+        <w:rPr>
+          <w:rtl w:val="0"/>
+        </w:rPr>
+        <w:t xml:space="preserve"> [IP of VM]:8032</w:t>
+      </w:r>
+    </w:p>
+    <w:p>
+      <w:pPr>
+        <w:numPr>
+          <w:ilvl w:val="3"/>
+          <w:numId w:val="1"/>
+        </w:numPr>
+        <w:ind w:left="2880" w:hanging="360"/>
+        <w:rPr>
+          <w:b w:val="1"/>
+          <w:u w:val="none"/>
+        </w:rPr>
+      </w:pPr>
+      <w:r>
+        <w:rPr>
+          <w:b w:val="1"/>
+          <w:rtl w:val="0"/>
+        </w:rPr>
+        <w:t xml:space="preserve">Inverter:</w:t>
+      </w:r>
+      <w:r>
+        <w:rPr>
+          <w:rtl w:val="0"/>
+        </w:rPr>
+        <w:t xml:space="preserve"> [IP of VM]:8033</w:t>
+      </w:r>
+    </w:p>
+    <w:p>
+      <w:pPr>
+        <w:numPr>
+          <w:ilvl w:val="3"/>
+          <w:numId w:val="1"/>
+        </w:numPr>
+        <w:ind w:left="2880" w:hanging="360"/>
+        <w:rPr>
+          <w:b w:val="1"/>
+          <w:u w:val="none"/>
+        </w:rPr>
+      </w:pPr>
+      <w:r>
+        <w:rPr>
+          <w:b w:val="1"/>
+          <w:rtl w:val="0"/>
+        </w:rPr>
+        <w:t xml:space="preserve">Steam turbine control system:</w:t>
+      </w:r>
+      <w:r>
+        <w:rPr>
+          <w:rtl w:val="0"/>
+        </w:rPr>
+        <w:t xml:space="preserve"> [IP of VM]:8034</w:t>
+      </w:r>
+    </w:p>
+    <w:p>
+      <w:pPr>
+        <w:numPr>
+          <w:ilvl w:val="3"/>
+          <w:numId w:val="1"/>
+        </w:numPr>
+        <w:ind w:left="2880" w:hanging="360"/>
+      </w:pPr>
+      <w:r>
+        <w:rPr>
+          <w:rtl w:val="0"/>
+        </w:rPr>
+        <w:t xml:space="preserve">username and password: </w:t>
       </w:r>
       <w:r>
         <w:rPr>
@@ -706,13 +909,76 @@
           <w:u w:val="single"/>
           <w:rtl w:val="0"/>
         </w:rPr>
-        <w:t xml:space="preserve">user</w:t>
-      </w:r>
-      <w:r>
-        <w:rPr>
-          <w:rtl w:val="0"/>
-        </w:rPr>
-        <w:t xml:space="preserve">, password </w:t>
+        <w:t xml:space="preserve">openplc</w:t>
+      </w:r>
+    </w:p>
+    <w:p>
+      <w:pPr>
+        <w:numPr>
+          <w:ilvl w:val="1"/>
+          <w:numId w:val="1"/>
+        </w:numPr>
+        <w:ind w:left="1440" w:hanging="360"/>
+        <w:rPr>
+          <w:b w:val="1"/>
+        </w:rPr>
+      </w:pPr>
+      <w:r>
+        <w:rPr>
+          <w:b w:val="1"/>
+          <w:rtl w:val="0"/>
+        </w:rPr>
+        <w:t xml:space="preserve">Guacamole:</w:t>
+      </w:r>
+    </w:p>
+    <w:p>
+      <w:pPr>
+        <w:numPr>
+          <w:ilvl w:val="2"/>
+          <w:numId w:val="1"/>
+        </w:numPr>
+        <w:ind w:left="2160" w:hanging="360"/>
+        <w:rPr>
+          <w:b w:val="1"/>
+          <w:u w:val="none"/>
+        </w:rPr>
+      </w:pPr>
+      <w:r>
+        <w:rPr>
+          <w:b w:val="1"/>
+          <w:rtl w:val="0"/>
+        </w:rPr>
+        <w:t xml:space="preserve">Laptop:</w:t>
+      </w:r>
+    </w:p>
+    <w:p>
+      <w:pPr>
+        <w:numPr>
+          <w:ilvl w:val="3"/>
+          <w:numId w:val="1"/>
+        </w:numPr>
+        <w:ind w:left="2880" w:hanging="360"/>
+      </w:pPr>
+      <w:r>
+        <w:rPr>
+          <w:rtl w:val="0"/>
+        </w:rPr>
+        <w:t xml:space="preserve">[IP of VM]:8080/guacamole</w:t>
+      </w:r>
+    </w:p>
+    <w:p>
+      <w:pPr>
+        <w:numPr>
+          <w:ilvl w:val="4"/>
+          <w:numId w:val="1"/>
+        </w:numPr>
+        <w:ind w:left="3600" w:hanging="360"/>
+      </w:pPr>
+      <w:r>
+        <w:rPr>
+          <w:rtl w:val="0"/>
+        </w:rPr>
+        <w:t xml:space="preserve">username and password: </w:t>
       </w:r>
       <w:r>
         <w:rPr>
@@ -721,246 +987,6 @@
           <w:u w:val="single"/>
           <w:rtl w:val="0"/>
         </w:rPr>
-        <w:t xml:space="preserve">HuPqEpb%qC#^Z7qyai</w:t>
-      </w:r>
-    </w:p>
-    <w:p>
-      <w:pPr>
-        <w:numPr>
-          <w:ilvl w:val="1"/>
-          <w:numId w:val="1"/>
-        </w:numPr>
-        <w:ind w:left="1440" w:hanging="360"/>
-        <w:rPr>
-          <w:b w:val="1"/>
-        </w:rPr>
-      </w:pPr>
-      <w:r>
-        <w:rPr>
-          <w:b w:val="1"/>
-          <w:rtl w:val="0"/>
-        </w:rPr>
-        <w:t xml:space="preserve">OpenPLC:</w:t>
-      </w:r>
-    </w:p>
-    <w:p>
-      <w:pPr>
-        <w:numPr>
-          <w:ilvl w:val="2"/>
-          <w:numId w:val="1"/>
-        </w:numPr>
-        <w:ind w:left="2160" w:hanging="360"/>
-      </w:pPr>
-      <w:r>
-        <w:rPr>
-          <w:b w:val="1"/>
-          <w:rtl w:val="0"/>
-        </w:rPr>
-        <w:t xml:space="preserve">EV Charger</w:t>
-      </w:r>
-      <w:r>
-        <w:rPr>
-          <w:rtl w:val="0"/>
-        </w:rPr>
-        <w:t xml:space="preserve">: [IP of VM]:8083</w:t>
-      </w:r>
-    </w:p>
-    <w:p>
-      <w:pPr>
-        <w:numPr>
-          <w:ilvl w:val="3"/>
-          <w:numId w:val="1"/>
-        </w:numPr>
-        <w:ind w:left="2880" w:hanging="360"/>
-      </w:pPr>
-      <w:r>
-        <w:rPr>
-          <w:rtl w:val="0"/>
-        </w:rPr>
-        <w:t xml:space="preserve">username and password: </w:t>
-      </w:r>
-      <w:r>
-        <w:rPr>
-          <w:b w:val="1"/>
-          <w:i w:val="1"/>
-          <w:u w:val="single"/>
-          <w:rtl w:val="0"/>
-        </w:rPr>
-        <w:t xml:space="preserve">openplc</w:t>
-      </w:r>
-    </w:p>
-    <w:p>
-      <w:pPr>
-        <w:numPr>
-          <w:ilvl w:val="2"/>
-          <w:numId w:val="1"/>
-        </w:numPr>
-        <w:ind w:left="2160" w:hanging="360"/>
-      </w:pPr>
-      <w:r>
-        <w:rPr>
-          <w:b w:val="1"/>
-          <w:rtl w:val="0"/>
-        </w:rPr>
-        <w:t xml:space="preserve">Monorail</w:t>
-      </w:r>
-      <w:r>
-        <w:rPr>
-          <w:rtl w:val="0"/>
-        </w:rPr>
-        <w:t xml:space="preserve">: [IP of VM]:8084</w:t>
-      </w:r>
-    </w:p>
-    <w:p>
-      <w:pPr>
-        <w:numPr>
-          <w:ilvl w:val="3"/>
-          <w:numId w:val="1"/>
-        </w:numPr>
-        <w:ind w:left="2880" w:hanging="360"/>
-      </w:pPr>
-      <w:r>
-        <w:rPr>
-          <w:rtl w:val="0"/>
-        </w:rPr>
-        <w:t xml:space="preserve">username and password: </w:t>
-      </w:r>
-      <w:r>
-        <w:rPr>
-          <w:b w:val="1"/>
-          <w:i w:val="1"/>
-          <w:u w:val="single"/>
-          <w:rtl w:val="0"/>
-        </w:rPr>
-        <w:t xml:space="preserve">openplc</w:t>
-      </w:r>
-      <w:r>
-        <w:rPr>
-          <w:rtl w:val="0"/>
-        </w:rPr>
-      </w:r>
-    </w:p>
-    <w:p>
-      <w:pPr>
-        <w:numPr>
-          <w:ilvl w:val="2"/>
-          <w:numId w:val="1"/>
-        </w:numPr>
-        <w:ind w:left="2160" w:hanging="360"/>
-      </w:pPr>
-      <w:r>
-        <w:rPr>
-          <w:b w:val="1"/>
-          <w:rtl w:val="0"/>
-        </w:rPr>
-        <w:t xml:space="preserve">Power Plant</w:t>
-      </w:r>
-      <w:r>
-        <w:rPr>
-          <w:rtl w:val="0"/>
-        </w:rPr>
-        <w:t xml:space="preserve">: [IP of VM]:8085</w:t>
-      </w:r>
-    </w:p>
-    <w:p>
-      <w:pPr>
-        <w:numPr>
-          <w:ilvl w:val="3"/>
-          <w:numId w:val="1"/>
-        </w:numPr>
-        <w:ind w:left="2880" w:hanging="360"/>
-      </w:pPr>
-      <w:r>
-        <w:rPr>
-          <w:rtl w:val="0"/>
-        </w:rPr>
-        <w:t xml:space="preserve">username and password: </w:t>
-      </w:r>
-      <w:r>
-        <w:rPr>
-          <w:b w:val="1"/>
-          <w:i w:val="1"/>
-          <w:u w:val="single"/>
-          <w:rtl w:val="0"/>
-        </w:rPr>
-        <w:t xml:space="preserve">openplc</w:t>
-      </w:r>
-    </w:p>
-    <w:p>
-      <w:pPr>
-        <w:numPr>
-          <w:ilvl w:val="1"/>
-          <w:numId w:val="1"/>
-        </w:numPr>
-        <w:ind w:left="1440" w:hanging="360"/>
-        <w:rPr>
-          <w:b w:val="1"/>
-        </w:rPr>
-      </w:pPr>
-      <w:r>
-        <w:rPr>
-          <w:b w:val="1"/>
-          <w:rtl w:val="0"/>
-        </w:rPr>
-        <w:t xml:space="preserve">Guacamole:</w:t>
-      </w:r>
-    </w:p>
-    <w:p>
-      <w:pPr>
-        <w:numPr>
-          <w:ilvl w:val="2"/>
-          <w:numId w:val="1"/>
-        </w:numPr>
-        <w:ind w:left="2160" w:hanging="360"/>
-        <w:rPr>
-          <w:b w:val="1"/>
-          <w:u w:val="none"/>
-        </w:rPr>
-      </w:pPr>
-      <w:r>
-        <w:rPr>
-          <w:b w:val="1"/>
-          <w:rtl w:val="0"/>
-        </w:rPr>
-        <w:t xml:space="preserve">Laptop:</w:t>
-      </w:r>
-    </w:p>
-    <w:p>
-      <w:pPr>
-        <w:numPr>
-          <w:ilvl w:val="3"/>
-          <w:numId w:val="1"/>
-        </w:numPr>
-        <w:ind w:left="2880" w:hanging="360"/>
-      </w:pPr>
-      <w:r>
-        <w:rPr>
-          <w:rtl w:val="0"/>
-        </w:rPr>
-        <w:t xml:space="preserve">[IP of VM]:8080/guacamole</w:t>
-      </w:r>
-    </w:p>
-    <w:p>
-      <w:pPr>
-        <w:numPr>
-          <w:ilvl w:val="4"/>
-          <w:numId w:val="1"/>
-        </w:numPr>
-        <w:ind w:left="3600" w:hanging="360"/>
-      </w:pPr>
-      <w:r>
-        <w:rPr>
-          <w:rtl w:val="0"/>
-        </w:rPr>
-        <w:t xml:space="preserve">username and password: </w:t>
-      </w:r>
-      <w:r>
-        <w:rPr>
-          <w:b w:val="1"/>
-          <w:i w:val="1"/>
-          <w:u w:val="single"/>
-          <w:rtl w:val="0"/>
-        </w:rPr>
         <w:t xml:space="preserve">guacadmin</w:t>
       </w:r>
     </w:p>
@@ -1523,7 +1549,7 @@
         <w:rPr>
           <w:rtl w:val="0"/>
         </w:rPr>
-        <w:t xml:space="preserve"> respectively.</w:t>
+        <w:t xml:space="preserve"> respectively (while in the ‘GamifiedICS’ project folder).</w:t>
       </w:r>
       <w:r>
         <w:rPr>

</xml_diff>

<commit_message>
Fixed bug that gave 'user already exists' error for Guacamole containers (checked to see if user exists before attempting to create it), removed EV charger/monorail wordpress data files and corresponding lines in the setup script because those containers are no longer in use, added -p parameter to mkdir lines in the setup script to silently move on instead of failing if the directories already exist, and updating setup documentation to include a fix for the bug Thomas mentioned ('dos2unix' fix for endline characters)
</commit_message>
<xml_diff>
--- a/Backend/VM Setup/VM Setup Guide.docx
+++ b/Backend/VM Setup/VM Setup Guide.docx
@@ -385,6 +385,37 @@
           <w:rtl w:val="0"/>
         </w:rPr>
         <w:t xml:space="preserve">This will run the startup script and do the rest. It will take a few minutes.</w:t>
+      </w:r>
+    </w:p>
+    <w:p>
+      <w:pPr>
+        <w:numPr>
+          <w:ilvl w:val="2"/>
+          <w:numId w:val="1"/>
+        </w:numPr>
+        <w:ind w:left="2160" w:hanging="360"/>
+        <w:rPr>
+          <w:u w:val="none"/>
+        </w:rPr>
+      </w:pPr>
+      <w:r>
+        <w:rPr>
+          <w:rtl w:val="0"/>
+        </w:rPr>
+        <w:t xml:space="preserve">If you get a bunch of “not found”/”unable to locate package” errors, run </w:t>
+      </w:r>
+      <w:r>
+        <w:rPr>
+          <w:b w:val="1"/>
+          <w:rtl w:val="0"/>
+        </w:rPr>
+        <w:t xml:space="preserve">dos2unix setup.sh</w:t>
+      </w:r>
+      <w:r>
+        <w:rPr>
+          <w:rtl w:val="0"/>
+        </w:rPr>
+        <w:t xml:space="preserve"> and then try again.</w:t>
       </w:r>
     </w:p>
     <w:p>

</xml_diff>

<commit_message>
Updated VM setup documentation file, removed Saved/ and Intermediate/ because I didn't do it correctly last time (had to do 'git rm -r Saved/ Intermediate/').
</commit_message>
<xml_diff>
--- a/Backend/VM Setup/VM Setup Guide.docx
+++ b/Backend/VM Setup/VM Setup Guide.docx
@@ -214,6 +214,7 @@
       <w:r>
         <w:rPr>
           <w:b w:val="1"/>
+          <w:bCs w:val="1"/>
           <w:rtl w:val="0"/>
         </w:rPr>
         <w:t xml:space="preserve">NOTE</w:t>
@@ -227,6 +228,7 @@
       <w:r>
         <w:rPr>
           <w:b w:val="1"/>
+          <w:bCs w:val="1"/>
           <w:rtl w:val="0"/>
         </w:rPr>
         <w:t xml:space="preserve">So before you do anything, I would create a test file, reboot, and check to see if </w:t>
@@ -234,6 +236,7 @@
       <w:r>
         <w:rPr>
           <w:b w:val="1"/>
+          <w:bCs w:val="1"/>
           <w:rtl w:val="0"/>
         </w:rPr>
         <w:t xml:space="preserve">it saved</w:t>
@@ -262,6 +265,7 @@
       <w:r>
         <w:rPr>
           <w:b w:val="1"/>
+          <w:bCs w:val="1"/>
           <w:rtl w:val="0"/>
         </w:rPr>
         <w:t xml:space="preserve">VM Setup</w:t>
@@ -300,11 +304,13 @@
         <w:ind w:left="1440" w:hanging="360"/>
         <w:rPr>
           <w:b w:val="1"/>
-        </w:rPr>
-      </w:pPr>
-      <w:r>
-        <w:rPr>
-          <w:b w:val="1"/>
+          <w:bCs w:val="1"/>
+        </w:rPr>
+      </w:pPr>
+      <w:r>
+        <w:rPr>
+          <w:b w:val="1"/>
+          <w:bCs w:val="1"/>
           <w:rtl w:val="0"/>
         </w:rPr>
         <w:t xml:space="preserve">cd Desktop</w:t>
@@ -324,11 +330,13 @@
         <w:ind w:left="1440" w:hanging="360"/>
         <w:rPr>
           <w:b w:val="1"/>
-        </w:rPr>
-      </w:pPr>
-      <w:r>
-        <w:rPr>
-          <w:b w:val="1"/>
+          <w:bCs w:val="1"/>
+        </w:rPr>
+      </w:pPr>
+      <w:r>
+        <w:rPr>
+          <w:b w:val="1"/>
+          <w:bCs w:val="1"/>
           <w:rtl w:val="0"/>
         </w:rPr>
         <w:t xml:space="preserve">sudo chmod +x setup.sh</w:t>
@@ -359,13 +367,36 @@
           <w:numId w:val="1"/>
         </w:numPr>
         <w:ind w:left="1440" w:hanging="360"/>
-        <w:rPr>
-          <w:u w:val="none"/>
-        </w:rPr>
-      </w:pPr>
-      <w:r>
-        <w:rPr>
-          <w:b w:val="1"/>
+      </w:pPr>
+      <w:r>
+        <w:rPr>
+          <w:b w:val="1"/>
+          <w:bCs w:val="1"/>
+          <w:rtl w:val="0"/>
+        </w:rPr>
+        <w:t xml:space="preserve">dos2unix setup.sh</w:t>
+      </w:r>
+      <w:r>
+        <w:rPr>
+          <w:rtl w:val="0"/>
+        </w:rPr>
+      </w:r>
+    </w:p>
+    <w:p>
+      <w:pPr>
+        <w:numPr>
+          <w:ilvl w:val="1"/>
+          <w:numId w:val="1"/>
+        </w:numPr>
+        <w:ind w:left="1440" w:hanging="360"/>
+        <w:rPr>
+          <w:u w:val="none"/>
+        </w:rPr>
+      </w:pPr>
+      <w:r>
+        <w:rPr>
+          <w:b w:val="1"/>
+          <w:bCs w:val="1"/>
           <w:rtl w:val="0"/>
         </w:rPr>
         <w:t xml:space="preserve">./setup.sh</w:t>
@@ -385,37 +416,6 @@
           <w:rtl w:val="0"/>
         </w:rPr>
         <w:t xml:space="preserve">This will run the startup script and do the rest. It will take a few minutes.</w:t>
-      </w:r>
-    </w:p>
-    <w:p>
-      <w:pPr>
-        <w:numPr>
-          <w:ilvl w:val="2"/>
-          <w:numId w:val="1"/>
-        </w:numPr>
-        <w:ind w:left="2160" w:hanging="360"/>
-        <w:rPr>
-          <w:u w:val="none"/>
-        </w:rPr>
-      </w:pPr>
-      <w:r>
-        <w:rPr>
-          <w:rtl w:val="0"/>
-        </w:rPr>
-        <w:t xml:space="preserve">If you get a bunch of “not found”/”unable to locate package” errors, run </w:t>
-      </w:r>
-      <w:r>
-        <w:rPr>
-          <w:b w:val="1"/>
-          <w:rtl w:val="0"/>
-        </w:rPr>
-        <w:t xml:space="preserve">dos2unix setup.sh</w:t>
-      </w:r>
-      <w:r>
-        <w:rPr>
-          <w:rtl w:val="0"/>
-        </w:rPr>
-        <w:t xml:space="preserve"> and then try again.</w:t>
       </w:r>
     </w:p>
     <w:p>
@@ -468,6 +468,7 @@
       <w:r>
         <w:rPr>
           <w:b w:val="1"/>
+          <w:bCs w:val="1"/>
           <w:rtl w:val="0"/>
         </w:rPr>
         <w:t xml:space="preserve">ip a</w:t>
@@ -481,6 +482,7 @@
       <w:r>
         <w:rPr>
           <w:b w:val="1"/>
+          <w:bCs w:val="1"/>
           <w:rtl w:val="0"/>
         </w:rPr>
         <w:t xml:space="preserve">eth0</w:t>
@@ -491,6 +493,11 @@
         </w:rPr>
         <w:t xml:space="preserve">, or something similar. The first IP in purple is the one you will use to connect to the various containers:</w:t>
       </w:r>
+      <w:r>
+        <w:rPr>
+          <w:rtl w:val="0"/>
+        </w:rPr>
+      </w:r>
     </w:p>
     <w:p>
       <w:pPr>
@@ -501,32 +508,214 @@
         <w:ind w:left="1440" w:hanging="360"/>
         <w:rPr>
           <w:b w:val="1"/>
-        </w:rPr>
-      </w:pPr>
-      <w:r>
-        <w:rPr>
-          <w:b w:val="1"/>
-          <w:rtl w:val="0"/>
-        </w:rPr>
-        <w:t xml:space="preserve">Wordpress:</w:t>
-      </w:r>
-      <w:r>
-        <w:rPr>
-          <w:rtl w:val="0"/>
-        </w:rPr>
-      </w:r>
-    </w:p>
-    <w:p>
-      <w:pPr>
-        <w:numPr>
-          <w:ilvl w:val="2"/>
-          <w:numId w:val="1"/>
-        </w:numPr>
-        <w:ind w:left="2160" w:hanging="360"/>
-      </w:pPr>
-      <w:r>
-        <w:rPr>
-          <w:b w:val="1"/>
+          <w:bCs w:val="1"/>
+        </w:rPr>
+      </w:pPr>
+      <w:r>
+        <w:rPr>
+          <w:b w:val="1"/>
+          <w:bCs w:val="1"/>
+          <w:rtl w:val="0"/>
+        </w:rPr>
+        <w:t xml:space="preserve">OpenPLC:</w:t>
+      </w:r>
+    </w:p>
+    <w:p>
+      <w:pPr>
+        <w:numPr>
+          <w:ilvl w:val="2"/>
+          <w:numId w:val="1"/>
+        </w:numPr>
+        <w:ind w:left="2160" w:hanging="360"/>
+      </w:pPr>
+      <w:r>
+        <w:rPr>
+          <w:b w:val="1"/>
+          <w:bCs w:val="1"/>
+          <w:rtl w:val="0"/>
+        </w:rPr>
+        <w:t xml:space="preserve">EV Charger</w:t>
+      </w:r>
+      <w:r>
+        <w:rPr>
+          <w:rtl w:val="0"/>
+        </w:rPr>
+        <w:t xml:space="preserve">:</w:t>
+      </w:r>
+    </w:p>
+    <w:p>
+      <w:pPr>
+        <w:numPr>
+          <w:ilvl w:val="3"/>
+          <w:numId w:val="1"/>
+        </w:numPr>
+        <w:ind w:left="2880" w:hanging="360"/>
+        <w:rPr>
+          <w:b w:val="1"/>
+          <w:bCs w:val="1"/>
+        </w:rPr>
+      </w:pPr>
+      <w:r>
+        <w:rPr>
+          <w:b w:val="1"/>
+          <w:bCs w:val="1"/>
+          <w:rtl w:val="0"/>
+        </w:rPr>
+        <w:t xml:space="preserve">Inverter:</w:t>
+      </w:r>
+      <w:r>
+        <w:rPr>
+          <w:rtl w:val="0"/>
+        </w:rPr>
+        <w:t xml:space="preserve"> [IP of VM]:8010</w:t>
+      </w:r>
+    </w:p>
+    <w:p>
+      <w:pPr>
+        <w:numPr>
+          <w:ilvl w:val="3"/>
+          <w:numId w:val="1"/>
+        </w:numPr>
+        <w:ind w:left="2880" w:hanging="360"/>
+        <w:rPr>
+          <w:b w:val="1"/>
+          <w:bCs w:val="1"/>
+        </w:rPr>
+      </w:pPr>
+      <w:r>
+        <w:rPr>
+          <w:b w:val="1"/>
+          <w:bCs w:val="1"/>
+          <w:rtl w:val="0"/>
+        </w:rPr>
+        <w:t xml:space="preserve">Communications:</w:t>
+      </w:r>
+      <w:r>
+        <w:rPr>
+          <w:rtl w:val="0"/>
+        </w:rPr>
+        <w:t xml:space="preserve"> [IP of VM]:8011</w:t>
+      </w:r>
+    </w:p>
+    <w:p>
+      <w:pPr>
+        <w:numPr>
+          <w:ilvl w:val="3"/>
+          <w:numId w:val="1"/>
+        </w:numPr>
+        <w:ind w:left="2880" w:hanging="360"/>
+      </w:pPr>
+      <w:r>
+        <w:rPr>
+          <w:rtl w:val="0"/>
+        </w:rPr>
+        <w:t xml:space="preserve">username and password: </w:t>
+      </w:r>
+      <w:r>
+        <w:rPr>
+          <w:b w:val="1"/>
+          <w:bCs w:val="1"/>
+          <w:i w:val="1"/>
+          <w:iCs w:val="1"/>
+          <w:u w:val="single"/>
+          <w:rtl w:val="0"/>
+        </w:rPr>
+        <w:t xml:space="preserve">openplc</w:t>
+      </w:r>
+    </w:p>
+    <w:p>
+      <w:pPr>
+        <w:numPr>
+          <w:ilvl w:val="2"/>
+          <w:numId w:val="1"/>
+        </w:numPr>
+        <w:ind w:left="2160" w:hanging="360"/>
+      </w:pPr>
+      <w:r>
+        <w:rPr>
+          <w:b w:val="1"/>
+          <w:bCs w:val="1"/>
+          <w:rtl w:val="0"/>
+        </w:rPr>
+        <w:t xml:space="preserve">Monorail</w:t>
+      </w:r>
+      <w:r>
+        <w:rPr>
+          <w:rtl w:val="0"/>
+        </w:rPr>
+        <w:t xml:space="preserve">:</w:t>
+      </w:r>
+    </w:p>
+    <w:p>
+      <w:pPr>
+        <w:numPr>
+          <w:ilvl w:val="3"/>
+          <w:numId w:val="1"/>
+        </w:numPr>
+        <w:ind w:left="2880" w:hanging="360"/>
+        <w:rPr>
+          <w:b w:val="1"/>
+          <w:bCs w:val="1"/>
+        </w:rPr>
+      </w:pPr>
+      <w:r>
+        <w:rPr>
+          <w:b w:val="1"/>
+          <w:bCs w:val="1"/>
+          <w:rtl w:val="0"/>
+        </w:rPr>
+        <w:t xml:space="preserve">Placeholder:</w:t>
+      </w:r>
+      <w:r>
+        <w:rPr>
+          <w:rtl w:val="0"/>
+        </w:rPr>
+        <w:t xml:space="preserve"> [IP of VM]:8020</w:t>
+      </w:r>
+    </w:p>
+    <w:p>
+      <w:pPr>
+        <w:numPr>
+          <w:ilvl w:val="3"/>
+          <w:numId w:val="1"/>
+        </w:numPr>
+        <w:ind w:left="2880" w:hanging="360"/>
+      </w:pPr>
+      <w:r>
+        <w:rPr>
+          <w:rtl w:val="0"/>
+        </w:rPr>
+        <w:t xml:space="preserve">username and password: </w:t>
+      </w:r>
+      <w:r>
+        <w:rPr>
+          <w:b w:val="1"/>
+          <w:bCs w:val="1"/>
+          <w:i w:val="1"/>
+          <w:iCs w:val="1"/>
+          <w:u w:val="single"/>
+          <w:rtl w:val="0"/>
+        </w:rPr>
+        <w:t xml:space="preserve">openplc</w:t>
+      </w:r>
+      <w:r>
+        <w:rPr>
+          <w:rtl w:val="0"/>
+        </w:rPr>
+      </w:r>
+    </w:p>
+    <w:p>
+      <w:pPr>
+        <w:numPr>
+          <w:ilvl w:val="2"/>
+          <w:numId w:val="1"/>
+        </w:numPr>
+        <w:ind w:left="2160" w:hanging="360"/>
+      </w:pPr>
+      <w:r>
+        <w:rPr>
+          <w:b w:val="1"/>
+          <w:bCs w:val="1"/>
           <w:rtl w:val="0"/>
         </w:rPr>
         <w:t xml:space="preserve">Power Plant</w:t>
@@ -535,7 +724,7 @@
         <w:rPr>
           <w:rtl w:val="0"/>
         </w:rPr>
-        <w:t xml:space="preserve">: [IP of VM]:8002/wp-admin</w:t>
+        <w:t xml:space="preserve">:</w:t>
       </w:r>
     </w:p>
     <w:p>
@@ -545,77 +734,514 @@
           <w:numId w:val="1"/>
         </w:numPr>
         <w:ind w:left="2880" w:hanging="360"/>
-      </w:pPr>
-      <w:r>
-        <w:rPr>
-          <w:rtl w:val="0"/>
-        </w:rPr>
-        <w:t xml:space="preserve">username </w:t>
-      </w:r>
-      <w:r>
-        <w:rPr>
-          <w:b w:val="1"/>
+        <w:rPr>
+          <w:b w:val="1"/>
+          <w:bCs w:val="1"/>
+        </w:rPr>
+      </w:pPr>
+      <w:r>
+        <w:rPr>
+          <w:b w:val="1"/>
+          <w:bCs w:val="1"/>
+          <w:rtl w:val="0"/>
+        </w:rPr>
+        <w:t xml:space="preserve">Cooling pump:</w:t>
+      </w:r>
+      <w:r>
+        <w:rPr>
+          <w:rtl w:val="0"/>
+        </w:rPr>
+        <w:t xml:space="preserve"> [IP of VM]:8030</w:t>
+      </w:r>
+    </w:p>
+    <w:p>
+      <w:pPr>
+        <w:numPr>
+          <w:ilvl w:val="3"/>
+          <w:numId w:val="1"/>
+        </w:numPr>
+        <w:ind w:left="2880" w:hanging="360"/>
+        <w:rPr>
+          <w:b w:val="1"/>
+          <w:bCs w:val="1"/>
+          <w:u w:val="none"/>
+        </w:rPr>
+      </w:pPr>
+      <w:r>
+        <w:rPr>
+          <w:b w:val="1"/>
+          <w:bCs w:val="1"/>
+          <w:rtl w:val="0"/>
+        </w:rPr>
+        <w:t xml:space="preserve">Geiger counter:</w:t>
+      </w:r>
+      <w:r>
+        <w:rPr>
+          <w:rtl w:val="0"/>
+        </w:rPr>
+        <w:t xml:space="preserve"> [IP of VM]:8031</w:t>
+      </w:r>
+    </w:p>
+    <w:p>
+      <w:pPr>
+        <w:numPr>
+          <w:ilvl w:val="3"/>
+          <w:numId w:val="1"/>
+        </w:numPr>
+        <w:ind w:left="2880" w:hanging="360"/>
+        <w:rPr>
+          <w:b w:val="1"/>
+          <w:bCs w:val="1"/>
+          <w:u w:val="none"/>
+        </w:rPr>
+      </w:pPr>
+      <w:r>
+        <w:rPr>
+          <w:b w:val="1"/>
+          <w:bCs w:val="1"/>
+          <w:rtl w:val="0"/>
+        </w:rPr>
+        <w:t xml:space="preserve">Heat sensor:</w:t>
+      </w:r>
+      <w:r>
+        <w:rPr>
+          <w:rtl w:val="0"/>
+        </w:rPr>
+        <w:t xml:space="preserve"> [IP of VM]:8032</w:t>
+      </w:r>
+    </w:p>
+    <w:p>
+      <w:pPr>
+        <w:numPr>
+          <w:ilvl w:val="3"/>
+          <w:numId w:val="1"/>
+        </w:numPr>
+        <w:ind w:left="2880" w:hanging="360"/>
+        <w:rPr>
+          <w:b w:val="1"/>
+          <w:bCs w:val="1"/>
+          <w:u w:val="none"/>
+        </w:rPr>
+      </w:pPr>
+      <w:r>
+        <w:rPr>
+          <w:b w:val="1"/>
+          <w:bCs w:val="1"/>
+          <w:rtl w:val="0"/>
+        </w:rPr>
+        <w:t xml:space="preserve">Inverter:</w:t>
+      </w:r>
+      <w:r>
+        <w:rPr>
+          <w:rtl w:val="0"/>
+        </w:rPr>
+        <w:t xml:space="preserve"> [IP of VM]:8033</w:t>
+      </w:r>
+    </w:p>
+    <w:p>
+      <w:pPr>
+        <w:numPr>
+          <w:ilvl w:val="3"/>
+          <w:numId w:val="1"/>
+        </w:numPr>
+        <w:ind w:left="2880" w:hanging="360"/>
+        <w:rPr>
+          <w:b w:val="1"/>
+          <w:bCs w:val="1"/>
+          <w:u w:val="none"/>
+        </w:rPr>
+      </w:pPr>
+      <w:r>
+        <w:rPr>
+          <w:b w:val="1"/>
+          <w:bCs w:val="1"/>
+          <w:rtl w:val="0"/>
+        </w:rPr>
+        <w:t xml:space="preserve">Steam turbine control system:</w:t>
+      </w:r>
+      <w:r>
+        <w:rPr>
+          <w:rtl w:val="0"/>
+        </w:rPr>
+        <w:t xml:space="preserve"> [IP of VM]:8034</w:t>
+      </w:r>
+    </w:p>
+    <w:p>
+      <w:pPr>
+        <w:numPr>
+          <w:ilvl w:val="3"/>
+          <w:numId w:val="1"/>
+        </w:numPr>
+        <w:ind w:left="2880" w:hanging="360"/>
+      </w:pPr>
+      <w:r>
+        <w:rPr>
+          <w:rtl w:val="0"/>
+        </w:rPr>
+        <w:t xml:space="preserve">username and password: </w:t>
+      </w:r>
+      <w:r>
+        <w:rPr>
+          <w:b w:val="1"/>
+          <w:bCs w:val="1"/>
           <w:i w:val="1"/>
+          <w:iCs w:val="1"/>
           <w:u w:val="single"/>
           <w:rtl w:val="0"/>
         </w:rPr>
+        <w:t xml:space="preserve">openplc</w:t>
+      </w:r>
+    </w:p>
+    <w:p>
+      <w:pPr>
+        <w:numPr>
+          <w:ilvl w:val="1"/>
+          <w:numId w:val="1"/>
+        </w:numPr>
+        <w:ind w:left="1440" w:hanging="360"/>
+        <w:rPr>
+          <w:b w:val="1"/>
+          <w:bCs w:val="1"/>
+        </w:rPr>
+      </w:pPr>
+      <w:r>
+        <w:rPr>
+          <w:b w:val="1"/>
+          <w:bCs w:val="1"/>
+          <w:rtl w:val="0"/>
+        </w:rPr>
+        <w:t xml:space="preserve">Guacamole:</w:t>
+      </w:r>
+      <w:r>
+        <w:rPr>
+          <w:rtl w:val="0"/>
+        </w:rPr>
+      </w:r>
+    </w:p>
+    <w:p>
+      <w:pPr>
+        <w:numPr>
+          <w:ilvl w:val="2"/>
+          <w:numId w:val="1"/>
+        </w:numPr>
+        <w:ind w:left="2160" w:hanging="360"/>
+        <w:rPr>
+          <w:b w:val="1"/>
+          <w:bCs w:val="1"/>
+        </w:rPr>
+      </w:pPr>
+      <w:r>
+        <w:rPr>
+          <w:b w:val="1"/>
+          <w:bCs w:val="1"/>
+          <w:rtl w:val="0"/>
+        </w:rPr>
+        <w:t xml:space="preserve">EV Charger:</w:t>
+      </w:r>
+      <w:r>
+        <w:rPr>
+          <w:rtl w:val="0"/>
+        </w:rPr>
+      </w:r>
+    </w:p>
+    <w:p>
+      <w:pPr>
+        <w:numPr>
+          <w:ilvl w:val="3"/>
+          <w:numId w:val="1"/>
+        </w:numPr>
+        <w:ind w:left="2880" w:hanging="360"/>
+      </w:pPr>
+      <w:r>
+        <w:rPr>
+          <w:rtl w:val="0"/>
+        </w:rPr>
+        <w:t xml:space="preserve">[IP of VM]:8090/guacamole</w:t>
+      </w:r>
+    </w:p>
+    <w:p>
+      <w:pPr>
+        <w:numPr>
+          <w:ilvl w:val="4"/>
+          <w:numId w:val="1"/>
+        </w:numPr>
+        <w:ind w:left="3600" w:hanging="360"/>
+      </w:pPr>
+      <w:r>
+        <w:rPr>
+          <w:rtl w:val="0"/>
+        </w:rPr>
+        <w:t xml:space="preserve">You will need to make a connection to the EV-charger container, which will simulate the user’s in-game laptop for the EV charger mission:</w:t>
+      </w:r>
+    </w:p>
+    <w:p>
+      <w:pPr>
+        <w:numPr>
+          <w:ilvl w:val="5"/>
+          <w:numId w:val="1"/>
+        </w:numPr>
+        <w:ind w:left="4320" w:hanging="360"/>
+      </w:pPr>
+      <w:r>
+        <w:rPr>
+          <w:rtl w:val="0"/>
+        </w:rPr>
+        <w:t xml:space="preserve">Click on the “guacadmin” in the top right -&gt; Settings.</w:t>
+      </w:r>
+    </w:p>
+    <w:p>
+      <w:pPr>
+        <w:numPr>
+          <w:ilvl w:val="5"/>
+          <w:numId w:val="1"/>
+        </w:numPr>
+        <w:ind w:left="4320" w:hanging="360"/>
+      </w:pPr>
+      <w:r>
+        <w:rPr>
+          <w:rtl w:val="0"/>
+        </w:rPr>
+        <w:t xml:space="preserve">Go to Connections (the bar near the top) -&gt; New Connection.</w:t>
+      </w:r>
+    </w:p>
+    <w:p>
+      <w:pPr>
+        <w:numPr>
+          <w:ilvl w:val="5"/>
+          <w:numId w:val="1"/>
+        </w:numPr>
+        <w:ind w:left="4320" w:hanging="360"/>
+      </w:pPr>
+      <w:r>
+        <w:rPr>
+          <w:rtl w:val="0"/>
+        </w:rPr>
+        <w:t xml:space="preserve">Fill in the following fields:</w:t>
+      </w:r>
+    </w:p>
+    <w:p>
+      <w:pPr>
+        <w:numPr>
+          <w:ilvl w:val="6"/>
+          <w:numId w:val="1"/>
+        </w:numPr>
+        <w:ind w:left="5040" w:hanging="360"/>
+      </w:pPr>
+      <w:r>
+        <w:rPr>
+          <w:rtl w:val="0"/>
+        </w:rPr>
+        <w:t xml:space="preserve">Name: choose a name: </w:t>
+      </w:r>
+      <w:r>
+        <w:rPr>
+          <w:b w:val="1"/>
+          <w:bCs w:val="1"/>
+          <w:rtl w:val="0"/>
+        </w:rPr>
+        <w:t xml:space="preserve">EV charger</w:t>
+      </w:r>
+    </w:p>
+    <w:p>
+      <w:pPr>
+        <w:numPr>
+          <w:ilvl w:val="6"/>
+          <w:numId w:val="1"/>
+        </w:numPr>
+        <w:ind w:left="5040" w:hanging="360"/>
+      </w:pPr>
+      <w:r>
+        <w:rPr>
+          <w:rtl w:val="0"/>
+        </w:rPr>
+        <w:t xml:space="preserve">Protocol: </w:t>
+      </w:r>
+      <w:r>
+        <w:rPr>
+          <w:b w:val="1"/>
+          <w:bCs w:val="1"/>
+          <w:rtl w:val="0"/>
+        </w:rPr>
+        <w:t xml:space="preserve">SSH</w:t>
+      </w:r>
+    </w:p>
+    <w:p>
+      <w:pPr>
+        <w:numPr>
+          <w:ilvl w:val="6"/>
+          <w:numId w:val="1"/>
+        </w:numPr>
+        <w:ind w:left="5040" w:hanging="360"/>
+      </w:pPr>
+      <w:r>
+        <w:rPr>
+          <w:rtl w:val="0"/>
+        </w:rPr>
+        <w:t xml:space="preserve">Parameters -&gt; Network -&gt; Hostname: </w:t>
+      </w:r>
+      <w:r>
+        <w:rPr>
+          <w:b w:val="1"/>
+          <w:bCs w:val="1"/>
+          <w:rtl w:val="0"/>
+        </w:rPr>
+        <w:t xml:space="preserve">EV-charger</w:t>
+      </w:r>
+    </w:p>
+    <w:p>
+      <w:pPr>
+        <w:numPr>
+          <w:ilvl w:val="6"/>
+          <w:numId w:val="1"/>
+        </w:numPr>
+        <w:ind w:left="5040" w:hanging="360"/>
+      </w:pPr>
+      <w:r>
+        <w:rPr>
+          <w:rtl w:val="0"/>
+        </w:rPr>
+        <w:t xml:space="preserve">Parameters -&gt; Network -&gt; Port: </w:t>
+      </w:r>
+      <w:r>
+        <w:rPr>
+          <w:b w:val="1"/>
+          <w:bCs w:val="1"/>
+          <w:rtl w:val="0"/>
+        </w:rPr>
+        <w:t xml:space="preserve">22 </w:t>
+      </w:r>
+      <w:r>
+        <w:rPr>
+          <w:rtl w:val="0"/>
+        </w:rPr>
+        <w:t xml:space="preserve">(SSH default port)</w:t>
+      </w:r>
+    </w:p>
+    <w:p>
+      <w:pPr>
+        <w:numPr>
+          <w:ilvl w:val="6"/>
+          <w:numId w:val="1"/>
+        </w:numPr>
+        <w:ind w:left="5040" w:hanging="360"/>
+      </w:pPr>
+      <w:r>
+        <w:rPr>
+          <w:rtl w:val="0"/>
+        </w:rPr>
+        <w:t xml:space="preserve">Parameters -&gt; Authentication -&gt; Username: </w:t>
+      </w:r>
+      <w:r>
+        <w:rPr>
+          <w:b w:val="1"/>
+          <w:bCs w:val="1"/>
+          <w:rtl w:val="0"/>
+        </w:rPr>
         <w:t xml:space="preserve">user</w:t>
       </w:r>
-      <w:r>
-        <w:rPr>
-          <w:rtl w:val="0"/>
-        </w:rPr>
-        <w:t xml:space="preserve">, password </w:t>
-      </w:r>
-      <w:r>
-        <w:rPr>
-          <w:b w:val="1"/>
-          <w:i w:val="1"/>
-          <w:u w:val="single"/>
-          <w:rtl w:val="0"/>
-        </w:rPr>
-        <w:t xml:space="preserve">HuPqEpb%qC#^Z7qyai</w:t>
-      </w:r>
-    </w:p>
-    <w:p>
-      <w:pPr>
-        <w:numPr>
-          <w:ilvl w:val="1"/>
-          <w:numId w:val="1"/>
-        </w:numPr>
-        <w:ind w:left="1440" w:hanging="360"/>
-        <w:rPr>
-          <w:b w:val="1"/>
-        </w:rPr>
-      </w:pPr>
-      <w:r>
-        <w:rPr>
-          <w:b w:val="1"/>
-          <w:rtl w:val="0"/>
-        </w:rPr>
-        <w:t xml:space="preserve">OpenPLC:</w:t>
-      </w:r>
-    </w:p>
-    <w:p>
-      <w:pPr>
-        <w:numPr>
-          <w:ilvl w:val="2"/>
-          <w:numId w:val="1"/>
-        </w:numPr>
-        <w:ind w:left="2160" w:hanging="360"/>
-      </w:pPr>
-      <w:r>
-        <w:rPr>
-          <w:b w:val="1"/>
-          <w:rtl w:val="0"/>
-        </w:rPr>
-        <w:t xml:space="preserve">EV Charger</w:t>
-      </w:r>
-      <w:r>
-        <w:rPr>
-          <w:rtl w:val="0"/>
-        </w:rPr>
-        <w:t xml:space="preserve">:</w:t>
+    </w:p>
+    <w:p>
+      <w:pPr>
+        <w:numPr>
+          <w:ilvl w:val="6"/>
+          <w:numId w:val="1"/>
+        </w:numPr>
+        <w:ind w:left="5040" w:hanging="360"/>
+      </w:pPr>
+      <w:r>
+        <w:rPr>
+          <w:rtl w:val="0"/>
+        </w:rPr>
+        <w:t xml:space="preserve">Parameters -&gt; Authentication -&gt; Password: </w:t>
+      </w:r>
+      <w:r>
+        <w:rPr>
+          <w:b w:val="1"/>
+          <w:bCs w:val="1"/>
+          <w:rtl w:val="0"/>
+        </w:rPr>
+        <w:t xml:space="preserve">password</w:t>
+      </w:r>
+    </w:p>
+    <w:p>
+      <w:pPr>
+        <w:numPr>
+          <w:ilvl w:val="5"/>
+          <w:numId w:val="1"/>
+        </w:numPr>
+        <w:ind w:left="4320" w:hanging="360"/>
+      </w:pPr>
+      <w:r>
+        <w:rPr>
+          <w:rtl w:val="0"/>
+        </w:rPr>
+        <w:t xml:space="preserve">Go to the bottom and click Save.</w:t>
+      </w:r>
+    </w:p>
+    <w:p>
+      <w:pPr>
+        <w:numPr>
+          <w:ilvl w:val="5"/>
+          <w:numId w:val="1"/>
+        </w:numPr>
+        <w:ind w:left="4320" w:hanging="360"/>
+      </w:pPr>
+      <w:r>
+        <w:rPr>
+          <w:rtl w:val="0"/>
+        </w:rPr>
+        <w:t xml:space="preserve">Click on the “guacadmin” in the top right again -&gt; Home</w:t>
+      </w:r>
+    </w:p>
+    <w:p>
+      <w:pPr>
+        <w:numPr>
+          <w:ilvl w:val="5"/>
+          <w:numId w:val="1"/>
+        </w:numPr>
+        <w:ind w:left="4320" w:hanging="360"/>
+      </w:pPr>
+      <w:r>
+        <w:rPr>
+          <w:rtl w:val="0"/>
+        </w:rPr>
+        <w:t xml:space="preserve">You should see the connection now. Click it to test it out.</w:t>
+      </w:r>
+    </w:p>
+    <w:p>
+      <w:pPr>
+        <w:numPr>
+          <w:ilvl w:val="6"/>
+          <w:numId w:val="1"/>
+        </w:numPr>
+        <w:ind w:left="5040" w:hanging="360"/>
+      </w:pPr>
+      <w:r>
+        <w:rPr>
+          <w:rtl w:val="0"/>
+        </w:rPr>
+        <w:t xml:space="preserve">You should see a terminal if it worked correctly.</w:t>
+      </w:r>
+    </w:p>
+    <w:p>
+      <w:pPr>
+        <w:numPr>
+          <w:ilvl w:val="2"/>
+          <w:numId w:val="1"/>
+        </w:numPr>
+        <w:ind w:left="2160" w:hanging="360"/>
+        <w:rPr>
+          <w:b w:val="1"/>
+          <w:bCs w:val="1"/>
+        </w:rPr>
+      </w:pPr>
+      <w:r>
+        <w:rPr>
+          <w:b w:val="1"/>
+          <w:bCs w:val="1"/>
+          <w:rtl w:val="0"/>
+        </w:rPr>
+        <w:t xml:space="preserve">Monorail:</w:t>
       </w:r>
     </w:p>
     <w:p>
@@ -625,22 +1251,65 @@
           <w:numId w:val="1"/>
         </w:numPr>
         <w:ind w:left="2880" w:hanging="360"/>
-        <w:rPr>
-          <w:b w:val="1"/>
-        </w:rPr>
-      </w:pPr>
-      <w:r>
-        <w:rPr>
-          <w:b w:val="1"/>
-          <w:rtl w:val="0"/>
-        </w:rPr>
-        <w:t xml:space="preserve">Inverter:</w:t>
-      </w:r>
-      <w:r>
-        <w:rPr>
-          <w:rtl w:val="0"/>
-        </w:rPr>
-        <w:t xml:space="preserve"> [IP of VM]:8010</w:t>
+      </w:pPr>
+      <w:r>
+        <w:rPr>
+          <w:rtl w:val="0"/>
+        </w:rPr>
+        <w:t xml:space="preserve">[IP of VM]:8091/guacamole</w:t>
+      </w:r>
+    </w:p>
+    <w:p>
+      <w:pPr>
+        <w:numPr>
+          <w:ilvl w:val="4"/>
+          <w:numId w:val="1"/>
+        </w:numPr>
+        <w:ind w:left="3600" w:hanging="360"/>
+        <w:rPr>
+          <w:u w:val="none"/>
+        </w:rPr>
+      </w:pPr>
+      <w:r>
+        <w:rPr>
+          <w:rtl w:val="0"/>
+        </w:rPr>
+        <w:t xml:space="preserve">Make a connection the same way as above, changing the name and Parameters -&gt; Network -&gt; Hostname to </w:t>
+      </w:r>
+      <w:r>
+        <w:rPr>
+          <w:b w:val="1"/>
+          <w:bCs w:val="1"/>
+          <w:rtl w:val="0"/>
+        </w:rPr>
+        <w:t xml:space="preserve">Monorail</w:t>
+      </w:r>
+      <w:r>
+        <w:rPr>
+          <w:rtl w:val="0"/>
+        </w:rPr>
+        <w:t xml:space="preserve">.</w:t>
+      </w:r>
+    </w:p>
+    <w:p>
+      <w:pPr>
+        <w:numPr>
+          <w:ilvl w:val="2"/>
+          <w:numId w:val="1"/>
+        </w:numPr>
+        <w:ind w:left="2160" w:hanging="360"/>
+        <w:rPr>
+          <w:b w:val="1"/>
+          <w:bCs w:val="1"/>
+        </w:rPr>
+      </w:pPr>
+      <w:r>
+        <w:rPr>
+          <w:b w:val="1"/>
+          <w:bCs w:val="1"/>
+          <w:rtl w:val="0"/>
+        </w:rPr>
+        <w:t xml:space="preserve">Power plant:</w:t>
       </w:r>
     </w:p>
     <w:p>
@@ -650,351 +1319,12 @@
           <w:numId w:val="1"/>
         </w:numPr>
         <w:ind w:left="2880" w:hanging="360"/>
-        <w:rPr>
-          <w:b w:val="1"/>
-        </w:rPr>
-      </w:pPr>
-      <w:r>
-        <w:rPr>
-          <w:b w:val="1"/>
-          <w:rtl w:val="0"/>
-        </w:rPr>
-        <w:t xml:space="preserve">Communications:</w:t>
-      </w:r>
-      <w:r>
-        <w:rPr>
-          <w:rtl w:val="0"/>
-        </w:rPr>
-        <w:t xml:space="preserve"> [IP of VM]:8011</w:t>
-      </w:r>
-    </w:p>
-    <w:p>
-      <w:pPr>
-        <w:numPr>
-          <w:ilvl w:val="3"/>
-          <w:numId w:val="1"/>
-        </w:numPr>
-        <w:ind w:left="2880" w:hanging="360"/>
-      </w:pPr>
-      <w:r>
-        <w:rPr>
-          <w:rtl w:val="0"/>
-        </w:rPr>
-        <w:t xml:space="preserve">username and password: </w:t>
-      </w:r>
-      <w:r>
-        <w:rPr>
-          <w:b w:val="1"/>
-          <w:i w:val="1"/>
-          <w:u w:val="single"/>
-          <w:rtl w:val="0"/>
-        </w:rPr>
-        <w:t xml:space="preserve">openplc</w:t>
-      </w:r>
-    </w:p>
-    <w:p>
-      <w:pPr>
-        <w:numPr>
-          <w:ilvl w:val="2"/>
-          <w:numId w:val="1"/>
-        </w:numPr>
-        <w:ind w:left="2160" w:hanging="360"/>
-      </w:pPr>
-      <w:r>
-        <w:rPr>
-          <w:b w:val="1"/>
-          <w:rtl w:val="0"/>
-        </w:rPr>
-        <w:t xml:space="preserve">Monorail</w:t>
-      </w:r>
-      <w:r>
-        <w:rPr>
-          <w:rtl w:val="0"/>
-        </w:rPr>
-        <w:t xml:space="preserve">:</w:t>
-      </w:r>
-    </w:p>
-    <w:p>
-      <w:pPr>
-        <w:numPr>
-          <w:ilvl w:val="3"/>
-          <w:numId w:val="1"/>
-        </w:numPr>
-        <w:ind w:left="2880" w:hanging="360"/>
-        <w:rPr>
-          <w:b w:val="1"/>
-        </w:rPr>
-      </w:pPr>
-      <w:r>
-        <w:rPr>
-          <w:b w:val="1"/>
-          <w:rtl w:val="0"/>
-        </w:rPr>
-        <w:t xml:space="preserve">Placeholder:</w:t>
-      </w:r>
-      <w:r>
-        <w:rPr>
-          <w:rtl w:val="0"/>
-        </w:rPr>
-        <w:t xml:space="preserve"> [IP of VM]:8020</w:t>
-      </w:r>
-    </w:p>
-    <w:p>
-      <w:pPr>
-        <w:numPr>
-          <w:ilvl w:val="3"/>
-          <w:numId w:val="1"/>
-        </w:numPr>
-        <w:ind w:left="2880" w:hanging="360"/>
-      </w:pPr>
-      <w:r>
-        <w:rPr>
-          <w:rtl w:val="0"/>
-        </w:rPr>
-        <w:t xml:space="preserve">username and password: </w:t>
-      </w:r>
-      <w:r>
-        <w:rPr>
-          <w:b w:val="1"/>
-          <w:i w:val="1"/>
-          <w:u w:val="single"/>
-          <w:rtl w:val="0"/>
-        </w:rPr>
-        <w:t xml:space="preserve">openplc</w:t>
-      </w:r>
-      <w:r>
-        <w:rPr>
-          <w:rtl w:val="0"/>
-        </w:rPr>
-      </w:r>
-    </w:p>
-    <w:p>
-      <w:pPr>
-        <w:numPr>
-          <w:ilvl w:val="2"/>
-          <w:numId w:val="1"/>
-        </w:numPr>
-        <w:ind w:left="2160" w:hanging="360"/>
-      </w:pPr>
-      <w:r>
-        <w:rPr>
-          <w:b w:val="1"/>
-          <w:rtl w:val="0"/>
-        </w:rPr>
-        <w:t xml:space="preserve">Power Plant</w:t>
-      </w:r>
-      <w:r>
-        <w:rPr>
-          <w:rtl w:val="0"/>
-        </w:rPr>
-        <w:t xml:space="preserve">:</w:t>
-      </w:r>
-    </w:p>
-    <w:p>
-      <w:pPr>
-        <w:numPr>
-          <w:ilvl w:val="3"/>
-          <w:numId w:val="1"/>
-        </w:numPr>
-        <w:ind w:left="2880" w:hanging="360"/>
-        <w:rPr>
-          <w:b w:val="1"/>
-        </w:rPr>
-      </w:pPr>
-      <w:r>
-        <w:rPr>
-          <w:b w:val="1"/>
-          <w:rtl w:val="0"/>
-        </w:rPr>
-        <w:t xml:space="preserve">Cooling pump:</w:t>
-      </w:r>
-      <w:r>
-        <w:rPr>
-          <w:rtl w:val="0"/>
-        </w:rPr>
-        <w:t xml:space="preserve"> [IP of VM]:8030</w:t>
-      </w:r>
-    </w:p>
-    <w:p>
-      <w:pPr>
-        <w:numPr>
-          <w:ilvl w:val="3"/>
-          <w:numId w:val="1"/>
-        </w:numPr>
-        <w:ind w:left="2880" w:hanging="360"/>
-        <w:rPr>
-          <w:b w:val="1"/>
-          <w:u w:val="none"/>
-        </w:rPr>
-      </w:pPr>
-      <w:r>
-        <w:rPr>
-          <w:b w:val="1"/>
-          <w:rtl w:val="0"/>
-        </w:rPr>
-        <w:t xml:space="preserve">Geiger counter:</w:t>
-      </w:r>
-      <w:r>
-        <w:rPr>
-          <w:rtl w:val="0"/>
-        </w:rPr>
-        <w:t xml:space="preserve"> [IP of VM]:8031</w:t>
-      </w:r>
-    </w:p>
-    <w:p>
-      <w:pPr>
-        <w:numPr>
-          <w:ilvl w:val="3"/>
-          <w:numId w:val="1"/>
-        </w:numPr>
-        <w:ind w:left="2880" w:hanging="360"/>
-        <w:rPr>
-          <w:b w:val="1"/>
-          <w:u w:val="none"/>
-        </w:rPr>
-      </w:pPr>
-      <w:r>
-        <w:rPr>
-          <w:b w:val="1"/>
-          <w:rtl w:val="0"/>
-        </w:rPr>
-        <w:t xml:space="preserve">Heat sensor:</w:t>
-      </w:r>
-      <w:r>
-        <w:rPr>
-          <w:rtl w:val="0"/>
-        </w:rPr>
-        <w:t xml:space="preserve"> [IP of VM]:8032</w:t>
-      </w:r>
-    </w:p>
-    <w:p>
-      <w:pPr>
-        <w:numPr>
-          <w:ilvl w:val="3"/>
-          <w:numId w:val="1"/>
-        </w:numPr>
-        <w:ind w:left="2880" w:hanging="360"/>
-        <w:rPr>
-          <w:b w:val="1"/>
-          <w:u w:val="none"/>
-        </w:rPr>
-      </w:pPr>
-      <w:r>
-        <w:rPr>
-          <w:b w:val="1"/>
-          <w:rtl w:val="0"/>
-        </w:rPr>
-        <w:t xml:space="preserve">Inverter:</w:t>
-      </w:r>
-      <w:r>
-        <w:rPr>
-          <w:rtl w:val="0"/>
-        </w:rPr>
-        <w:t xml:space="preserve"> [IP of VM]:8033</w:t>
-      </w:r>
-    </w:p>
-    <w:p>
-      <w:pPr>
-        <w:numPr>
-          <w:ilvl w:val="3"/>
-          <w:numId w:val="1"/>
-        </w:numPr>
-        <w:ind w:left="2880" w:hanging="360"/>
-        <w:rPr>
-          <w:b w:val="1"/>
-          <w:u w:val="none"/>
-        </w:rPr>
-      </w:pPr>
-      <w:r>
-        <w:rPr>
-          <w:b w:val="1"/>
-          <w:rtl w:val="0"/>
-        </w:rPr>
-        <w:t xml:space="preserve">Steam turbine control system:</w:t>
-      </w:r>
-      <w:r>
-        <w:rPr>
-          <w:rtl w:val="0"/>
-        </w:rPr>
-        <w:t xml:space="preserve"> [IP of VM]:8034</w:t>
-      </w:r>
-    </w:p>
-    <w:p>
-      <w:pPr>
-        <w:numPr>
-          <w:ilvl w:val="3"/>
-          <w:numId w:val="1"/>
-        </w:numPr>
-        <w:ind w:left="2880" w:hanging="360"/>
-      </w:pPr>
-      <w:r>
-        <w:rPr>
-          <w:rtl w:val="0"/>
-        </w:rPr>
-        <w:t xml:space="preserve">username and password: </w:t>
-      </w:r>
-      <w:r>
-        <w:rPr>
-          <w:b w:val="1"/>
-          <w:i w:val="1"/>
-          <w:u w:val="single"/>
-          <w:rtl w:val="0"/>
-        </w:rPr>
-        <w:t xml:space="preserve">openplc</w:t>
-      </w:r>
-    </w:p>
-    <w:p>
-      <w:pPr>
-        <w:numPr>
-          <w:ilvl w:val="1"/>
-          <w:numId w:val="1"/>
-        </w:numPr>
-        <w:ind w:left="1440" w:hanging="360"/>
-        <w:rPr>
-          <w:b w:val="1"/>
-        </w:rPr>
-      </w:pPr>
-      <w:r>
-        <w:rPr>
-          <w:b w:val="1"/>
-          <w:rtl w:val="0"/>
-        </w:rPr>
-        <w:t xml:space="preserve">Guacamole:</w:t>
-      </w:r>
-    </w:p>
-    <w:p>
-      <w:pPr>
-        <w:numPr>
-          <w:ilvl w:val="2"/>
-          <w:numId w:val="1"/>
-        </w:numPr>
-        <w:ind w:left="2160" w:hanging="360"/>
-        <w:rPr>
-          <w:b w:val="1"/>
-          <w:u w:val="none"/>
-        </w:rPr>
-      </w:pPr>
-      <w:r>
-        <w:rPr>
-          <w:b w:val="1"/>
-          <w:rtl w:val="0"/>
-        </w:rPr>
-        <w:t xml:space="preserve">Laptop:</w:t>
-      </w:r>
-    </w:p>
-    <w:p>
-      <w:pPr>
-        <w:numPr>
-          <w:ilvl w:val="3"/>
-          <w:numId w:val="1"/>
-        </w:numPr>
-        <w:ind w:left="2880" w:hanging="360"/>
-      </w:pPr>
-      <w:r>
-        <w:rPr>
-          <w:rtl w:val="0"/>
-        </w:rPr>
-        <w:t xml:space="preserve">[IP of VM]:8080/guacamole</w:t>
+      </w:pPr>
+      <w:r>
+        <w:rPr>
+          <w:rtl w:val="0"/>
+        </w:rPr>
+        <w:t xml:space="preserve">[IP of VM]:8092/guacamole</w:t>
       </w:r>
     </w:p>
     <w:p>
@@ -1009,514 +1339,12 @@
         <w:rPr>
           <w:rtl w:val="0"/>
         </w:rPr>
-        <w:t xml:space="preserve">username and password: </w:t>
-      </w:r>
-      <w:r>
-        <w:rPr>
-          <w:b w:val="1"/>
-          <w:i w:val="1"/>
-          <w:u w:val="single"/>
-          <w:rtl w:val="0"/>
-        </w:rPr>
-        <w:t xml:space="preserve">guacadmin</w:t>
-      </w:r>
-    </w:p>
-    <w:p>
-      <w:pPr>
-        <w:numPr>
-          <w:ilvl w:val="4"/>
-          <w:numId w:val="1"/>
-        </w:numPr>
-        <w:ind w:left="3600" w:hanging="360"/>
-      </w:pPr>
-      <w:r>
-        <w:rPr>
-          <w:rtl w:val="0"/>
-        </w:rPr>
-        <w:t xml:space="preserve">You also need to make a connection to the Laptop container, which will simulate the user’s in-game laptop:</w:t>
-      </w:r>
-    </w:p>
-    <w:p>
-      <w:pPr>
-        <w:numPr>
-          <w:ilvl w:val="5"/>
-          <w:numId w:val="1"/>
-        </w:numPr>
-        <w:ind w:left="4320" w:hanging="360"/>
-      </w:pPr>
-      <w:r>
-        <w:rPr>
-          <w:rtl w:val="0"/>
-        </w:rPr>
-        <w:t xml:space="preserve">Click on the “guacadmin” in the top right -&gt; Settings.</w:t>
-      </w:r>
-    </w:p>
-    <w:p>
-      <w:pPr>
-        <w:numPr>
-          <w:ilvl w:val="5"/>
-          <w:numId w:val="1"/>
-        </w:numPr>
-        <w:ind w:left="4320" w:hanging="360"/>
-      </w:pPr>
-      <w:r>
-        <w:rPr>
-          <w:rtl w:val="0"/>
-        </w:rPr>
-        <w:t xml:space="preserve">Go to Connections (the bar near the top) -&gt; New Connection.</w:t>
-      </w:r>
-    </w:p>
-    <w:p>
-      <w:pPr>
-        <w:numPr>
-          <w:ilvl w:val="5"/>
-          <w:numId w:val="1"/>
-        </w:numPr>
-        <w:ind w:left="4320" w:hanging="360"/>
-      </w:pPr>
-      <w:r>
-        <w:rPr>
-          <w:rtl w:val="0"/>
-        </w:rPr>
-        <w:t xml:space="preserve">Fill in the following fields:</w:t>
-      </w:r>
-    </w:p>
-    <w:p>
-      <w:pPr>
-        <w:numPr>
-          <w:ilvl w:val="6"/>
-          <w:numId w:val="1"/>
-        </w:numPr>
-        <w:ind w:left="5040" w:hanging="360"/>
-      </w:pPr>
-      <w:r>
-        <w:rPr>
-          <w:rtl w:val="0"/>
-        </w:rPr>
-        <w:t xml:space="preserve">Name: choose a name: </w:t>
-      </w:r>
-      <w:r>
-        <w:rPr>
-          <w:b w:val="1"/>
-          <w:rtl w:val="0"/>
-        </w:rPr>
-        <w:t xml:space="preserve">Your Laptop</w:t>
-      </w:r>
-    </w:p>
-    <w:p>
-      <w:pPr>
-        <w:numPr>
-          <w:ilvl w:val="6"/>
-          <w:numId w:val="1"/>
-        </w:numPr>
-        <w:ind w:left="5040" w:hanging="360"/>
-      </w:pPr>
-      <w:r>
-        <w:rPr>
-          <w:rtl w:val="0"/>
-        </w:rPr>
-        <w:t xml:space="preserve">Protocol: </w:t>
-      </w:r>
-      <w:r>
-        <w:rPr>
-          <w:b w:val="1"/>
-          <w:rtl w:val="0"/>
-        </w:rPr>
-        <w:t xml:space="preserve">SSH</w:t>
-      </w:r>
-    </w:p>
-    <w:p>
-      <w:pPr>
-        <w:numPr>
-          <w:ilvl w:val="6"/>
-          <w:numId w:val="1"/>
-        </w:numPr>
-        <w:ind w:left="5040" w:hanging="360"/>
-      </w:pPr>
-      <w:r>
-        <w:rPr>
-          <w:rtl w:val="0"/>
-        </w:rPr>
-        <w:t xml:space="preserve">Parameters -&gt; Network -&gt; Hostname: </w:t>
-      </w:r>
-      <w:r>
-        <w:rPr>
-          <w:b w:val="1"/>
-          <w:rtl w:val="0"/>
-        </w:rPr>
-        <w:t xml:space="preserve">Laptop</w:t>
-      </w:r>
-    </w:p>
-    <w:p>
-      <w:pPr>
-        <w:numPr>
-          <w:ilvl w:val="6"/>
-          <w:numId w:val="1"/>
-        </w:numPr>
-        <w:ind w:left="5040" w:hanging="360"/>
-      </w:pPr>
-      <w:r>
-        <w:rPr>
-          <w:rtl w:val="0"/>
-        </w:rPr>
-        <w:t xml:space="preserve">Parameters -&gt; Network -&gt; Port: </w:t>
-      </w:r>
-      <w:r>
-        <w:rPr>
-          <w:b w:val="1"/>
-          <w:rtl w:val="0"/>
-        </w:rPr>
-        <w:t xml:space="preserve">22 </w:t>
-      </w:r>
-      <w:r>
-        <w:rPr>
-          <w:rtl w:val="0"/>
-        </w:rPr>
-        <w:t xml:space="preserve">(SSH default port)</w:t>
-      </w:r>
-    </w:p>
-    <w:p>
-      <w:pPr>
-        <w:numPr>
-          <w:ilvl w:val="6"/>
-          <w:numId w:val="1"/>
-        </w:numPr>
-        <w:ind w:left="5040" w:hanging="360"/>
-      </w:pPr>
-      <w:r>
-        <w:rPr>
-          <w:rtl w:val="0"/>
-        </w:rPr>
-        <w:t xml:space="preserve">Parameters -&gt; Authentication -&gt; Username: </w:t>
-      </w:r>
-      <w:r>
-        <w:rPr>
-          <w:b w:val="1"/>
-          <w:rtl w:val="0"/>
-        </w:rPr>
-        <w:t xml:space="preserve">root</w:t>
-      </w:r>
-    </w:p>
-    <w:p>
-      <w:pPr>
-        <w:numPr>
-          <w:ilvl w:val="6"/>
-          <w:numId w:val="1"/>
-        </w:numPr>
-        <w:ind w:left="5040" w:hanging="360"/>
-      </w:pPr>
-      <w:r>
-        <w:rPr>
-          <w:rtl w:val="0"/>
-        </w:rPr>
-        <w:t xml:space="preserve">Parameters -&gt; Authentication -&gt; Password: </w:t>
-      </w:r>
-      <w:r>
-        <w:rPr>
-          <w:b w:val="1"/>
-          <w:rtl w:val="0"/>
-        </w:rPr>
-        <w:t xml:space="preserve">root</w:t>
-      </w:r>
-    </w:p>
-    <w:p>
-      <w:pPr>
-        <w:numPr>
-          <w:ilvl w:val="5"/>
-          <w:numId w:val="1"/>
-        </w:numPr>
-        <w:ind w:left="4320" w:hanging="360"/>
-      </w:pPr>
-      <w:r>
-        <w:rPr>
-          <w:rtl w:val="0"/>
-        </w:rPr>
-        <w:t xml:space="preserve">Go to the bottom and click Save.</w:t>
-      </w:r>
-    </w:p>
-    <w:p>
-      <w:pPr>
-        <w:numPr>
-          <w:ilvl w:val="5"/>
-          <w:numId w:val="1"/>
-        </w:numPr>
-        <w:ind w:left="4320" w:hanging="360"/>
-      </w:pPr>
-      <w:r>
-        <w:rPr>
-          <w:rtl w:val="0"/>
-        </w:rPr>
-        <w:t xml:space="preserve">Click on the “guacadmin” in the top right again -&gt; Home</w:t>
-      </w:r>
-    </w:p>
-    <w:p>
-      <w:pPr>
-        <w:numPr>
-          <w:ilvl w:val="5"/>
-          <w:numId w:val="1"/>
-        </w:numPr>
-        <w:ind w:left="4320" w:hanging="360"/>
-      </w:pPr>
-      <w:r>
-        <w:rPr>
-          <w:rtl w:val="0"/>
-        </w:rPr>
-        <w:t xml:space="preserve">You should see the connection now. Click it to test it out.</w:t>
-      </w:r>
-    </w:p>
-    <w:p>
-      <w:pPr>
-        <w:numPr>
-          <w:ilvl w:val="6"/>
-          <w:numId w:val="1"/>
-        </w:numPr>
-        <w:ind w:left="5040" w:hanging="360"/>
-      </w:pPr>
-      <w:r>
-        <w:rPr>
-          <w:rtl w:val="0"/>
-        </w:rPr>
-        <w:t xml:space="preserve">You should see a terminal if it worked correctly.</w:t>
-      </w:r>
-    </w:p>
-    <w:p>
-      <w:pPr>
-        <w:numPr>
-          <w:ilvl w:val="2"/>
-          <w:numId w:val="1"/>
-        </w:numPr>
-        <w:ind w:left="2160" w:hanging="360"/>
-        <w:rPr>
-          <w:b w:val="1"/>
-        </w:rPr>
-      </w:pPr>
-      <w:r>
-        <w:rPr>
-          <w:b w:val="1"/>
-          <w:rtl w:val="0"/>
-        </w:rPr>
-        <w:t xml:space="preserve">EV Charger:</w:t>
-      </w:r>
-      <w:r>
-        <w:rPr>
-          <w:rtl w:val="0"/>
-        </w:rPr>
-      </w:r>
-    </w:p>
-    <w:p>
-      <w:pPr>
-        <w:numPr>
-          <w:ilvl w:val="3"/>
-          <w:numId w:val="1"/>
-        </w:numPr>
-        <w:ind w:left="2880" w:hanging="360"/>
-      </w:pPr>
-      <w:r>
-        <w:rPr>
-          <w:rtl w:val="0"/>
-        </w:rPr>
-        <w:t xml:space="preserve">[IP of VM]:8090/guacamole</w:t>
-      </w:r>
-    </w:p>
-    <w:p>
-      <w:pPr>
-        <w:numPr>
-          <w:ilvl w:val="4"/>
-          <w:numId w:val="1"/>
-        </w:numPr>
-        <w:ind w:left="3600" w:hanging="360"/>
-        <w:rPr>
-          <w:u w:val="none"/>
-        </w:rPr>
-      </w:pPr>
-      <w:r>
-        <w:rPr>
-          <w:rtl w:val="0"/>
-        </w:rPr>
-        <w:t xml:space="preserve">Make a connection the same as before, but change the name to “</w:t>
-      </w:r>
-      <w:r>
-        <w:rPr>
-          <w:b w:val="1"/>
-          <w:rtl w:val="0"/>
-        </w:rPr>
-        <w:t xml:space="preserve">EV Charger</w:t>
-      </w:r>
-      <w:r>
-        <w:rPr>
-          <w:rtl w:val="0"/>
-        </w:rPr>
-        <w:t xml:space="preserve">”, Network -&gt; Hostname to </w:t>
-      </w:r>
-      <w:r>
-        <w:rPr>
-          <w:b w:val="1"/>
-          <w:rtl w:val="0"/>
-        </w:rPr>
-        <w:t xml:space="preserve">EV-charger</w:t>
-      </w:r>
-      <w:r>
-        <w:rPr>
-          <w:rtl w:val="0"/>
-        </w:rPr>
-        <w:t xml:space="preserve">, and the authentication parameters to “</w:t>
-      </w:r>
-      <w:r>
-        <w:rPr>
-          <w:b w:val="1"/>
-          <w:rtl w:val="0"/>
-        </w:rPr>
-        <w:t xml:space="preserve">user</w:t>
-      </w:r>
-      <w:r>
-        <w:rPr>
-          <w:rtl w:val="0"/>
-        </w:rPr>
-        <w:t xml:space="preserve">” and “</w:t>
-      </w:r>
-      <w:r>
-        <w:rPr>
-          <w:b w:val="1"/>
-          <w:rtl w:val="0"/>
-        </w:rPr>
-        <w:t xml:space="preserve">password</w:t>
-      </w:r>
-      <w:r>
-        <w:rPr>
-          <w:rtl w:val="0"/>
-        </w:rPr>
-        <w:t xml:space="preserve">” (instead of “root” and “root”).</w:t>
-      </w:r>
-    </w:p>
-    <w:p>
-      <w:pPr>
-        <w:numPr>
-          <w:ilvl w:val="2"/>
-          <w:numId w:val="1"/>
-        </w:numPr>
-        <w:ind w:left="2160" w:hanging="360"/>
-        <w:rPr>
-          <w:b w:val="1"/>
-        </w:rPr>
-      </w:pPr>
-      <w:r>
-        <w:rPr>
-          <w:b w:val="1"/>
-          <w:rtl w:val="0"/>
-        </w:rPr>
-        <w:t xml:space="preserve">Monorail:</w:t>
-      </w:r>
-    </w:p>
-    <w:p>
-      <w:pPr>
-        <w:numPr>
-          <w:ilvl w:val="3"/>
-          <w:numId w:val="1"/>
-        </w:numPr>
-        <w:ind w:left="2880" w:hanging="360"/>
-      </w:pPr>
-      <w:r>
-        <w:rPr>
-          <w:rtl w:val="0"/>
-        </w:rPr>
-        <w:t xml:space="preserve">[IP of VM]:8091/guacamole</w:t>
-      </w:r>
-    </w:p>
-    <w:p>
-      <w:pPr>
-        <w:numPr>
-          <w:ilvl w:val="4"/>
-          <w:numId w:val="1"/>
-        </w:numPr>
-        <w:ind w:left="3600" w:hanging="360"/>
-        <w:rPr>
-          <w:u w:val="none"/>
-        </w:rPr>
-      </w:pPr>
-      <w:r>
-        <w:rPr>
-          <w:rtl w:val="0"/>
-        </w:rPr>
-        <w:t xml:space="preserve">Make a connection the same way as above, changing the name and Network -&gt; Hostname to </w:t>
-      </w:r>
-      <w:r>
-        <w:rPr>
-          <w:b w:val="1"/>
-          <w:rtl w:val="0"/>
-        </w:rPr>
-        <w:t xml:space="preserve">Monorail</w:t>
-      </w:r>
-      <w:r>
-        <w:rPr>
-          <w:rtl w:val="0"/>
-        </w:rPr>
-        <w:t xml:space="preserve">.</w:t>
-      </w:r>
-    </w:p>
-    <w:p>
-      <w:pPr>
-        <w:numPr>
-          <w:ilvl w:val="2"/>
-          <w:numId w:val="1"/>
-        </w:numPr>
-        <w:ind w:left="2160" w:hanging="360"/>
-        <w:rPr>
-          <w:b w:val="1"/>
-        </w:rPr>
-      </w:pPr>
-      <w:r>
-        <w:rPr>
-          <w:b w:val="1"/>
-          <w:rtl w:val="0"/>
-        </w:rPr>
-        <w:t xml:space="preserve">Power plant:</w:t>
-      </w:r>
-    </w:p>
-    <w:p>
-      <w:pPr>
-        <w:numPr>
-          <w:ilvl w:val="3"/>
-          <w:numId w:val="1"/>
-        </w:numPr>
-        <w:ind w:left="2880" w:hanging="360"/>
-      </w:pPr>
-      <w:r>
-        <w:rPr>
-          <w:rtl w:val="0"/>
-        </w:rPr>
-        <w:t xml:space="preserve">[IP of VM]:8092/guacamole</w:t>
-      </w:r>
-    </w:p>
-    <w:p>
-      <w:pPr>
-        <w:numPr>
-          <w:ilvl w:val="4"/>
-          <w:numId w:val="1"/>
-        </w:numPr>
-        <w:ind w:left="3600" w:hanging="360"/>
-      </w:pPr>
-      <w:r>
-        <w:rPr>
-          <w:rtl w:val="0"/>
-        </w:rPr>
-        <w:t xml:space="preserve">Make a connection the same way as above, changing the name to </w:t>
-      </w:r>
-      <w:r>
-        <w:rPr>
-          <w:b w:val="1"/>
-          <w:rtl w:val="0"/>
-        </w:rPr>
-        <w:t xml:space="preserve">Power Plant</w:t>
-      </w:r>
-      <w:r>
-        <w:rPr>
-          <w:rtl w:val="0"/>
-        </w:rPr>
-        <w:t xml:space="preserve"> and Network -&gt; Hostname to </w:t>
-      </w:r>
-      <w:r>
-        <w:rPr>
-          <w:b w:val="1"/>
+        <w:t xml:space="preserve">Make a connection the same way as above, changing the name and Parameters -&gt; Network -&gt; Hostname to </w:t>
+      </w:r>
+      <w:r>
+        <w:rPr>
+          <w:b w:val="1"/>
+          <w:bCs w:val="1"/>
           <w:rtl w:val="0"/>
         </w:rPr>
         <w:t xml:space="preserve">Power-plant</w:t>
@@ -1559,6 +1387,7 @@
       <w:r>
         <w:rPr>
           <w:b w:val="1"/>
+          <w:bCs w:val="1"/>
           <w:rtl w:val="0"/>
         </w:rPr>
         <w:t xml:space="preserve">sudo docker compose up -d</w:t>
@@ -1572,6 +1401,7 @@
       <w:r>
         <w:rPr>
           <w:b w:val="1"/>
+          <w:bCs w:val="1"/>
           <w:rtl w:val="0"/>
         </w:rPr>
         <w:t xml:space="preserve">sudo docker compose stop</w:t>
@@ -1582,57 +1412,118 @@
         </w:rPr>
         <w:t xml:space="preserve"> respectively (while in the ‘GamifiedICS’ project folder).</w:t>
       </w:r>
-      <w:r>
-        <w:rPr>
-          <w:rtl w:val="0"/>
-        </w:rPr>
-      </w:r>
-    </w:p>
-    <w:p>
-      <w:pPr>
-        <w:rPr>
-          <w:b w:val="1"/>
-        </w:rPr>
-      </w:pPr>
-      <w:r>
-        <w:rPr>
-          <w:rtl w:val="0"/>
-        </w:rPr>
-      </w:r>
-    </w:p>
-    <w:p>
-      <w:pPr>
-        <w:rPr>
-          <w:b w:val="1"/>
-        </w:rPr>
-      </w:pPr>
-      <w:r>
-        <w:rPr>
-          <w:rtl w:val="0"/>
-        </w:rPr>
-      </w:r>
-    </w:p>
-    <w:p>
-      <w:pPr>
-        <w:rPr>
-          <w:b w:val="1"/>
-        </w:rPr>
-      </w:pPr>
-      <w:r>
-        <w:rPr>
-          <w:rtl w:val="0"/>
-        </w:rPr>
-      </w:r>
-    </w:p>
-    <w:p>
-      <w:pPr>
-        <w:rPr>
-          <w:b w:val="1"/>
-        </w:rPr>
-      </w:pPr>
-      <w:r>
-        <w:rPr>
-          <w:b w:val="1"/>
+    </w:p>
+    <w:p>
+      <w:pPr>
+        <w:rPr/>
+      </w:pPr>
+      <w:r>
+        <w:rPr>
+          <w:rtl w:val="0"/>
+        </w:rPr>
+      </w:r>
+    </w:p>
+    <w:p>
+      <w:pPr>
+        <w:rPr/>
+      </w:pPr>
+      <w:r>
+        <w:rPr>
+          <w:rtl w:val="0"/>
+        </w:rPr>
+      </w:r>
+    </w:p>
+    <w:p>
+      <w:pPr>
+        <w:rPr/>
+      </w:pPr>
+      <w:r>
+        <w:rPr>
+          <w:rtl w:val="0"/>
+        </w:rPr>
+      </w:r>
+    </w:p>
+    <w:p>
+      <w:pPr>
+        <w:rPr/>
+      </w:pPr>
+      <w:r>
+        <w:rPr>
+          <w:rtl w:val="0"/>
+        </w:rPr>
+      </w:r>
+    </w:p>
+    <w:p>
+      <w:pPr>
+        <w:rPr/>
+      </w:pPr>
+      <w:r>
+        <w:rPr>
+          <w:rtl w:val="0"/>
+        </w:rPr>
+      </w:r>
+    </w:p>
+    <w:p>
+      <w:pPr>
+        <w:rPr/>
+      </w:pPr>
+      <w:r>
+        <w:rPr>
+          <w:rtl w:val="0"/>
+        </w:rPr>
+      </w:r>
+    </w:p>
+    <w:p>
+      <w:pPr>
+        <w:rPr/>
+      </w:pPr>
+      <w:r>
+        <w:rPr>
+          <w:rtl w:val="0"/>
+        </w:rPr>
+      </w:r>
+    </w:p>
+    <w:p>
+      <w:pPr>
+        <w:rPr/>
+      </w:pPr>
+      <w:r>
+        <w:rPr>
+          <w:rtl w:val="0"/>
+        </w:rPr>
+      </w:r>
+    </w:p>
+    <w:p>
+      <w:pPr>
+        <w:rPr/>
+      </w:pPr>
+      <w:r>
+        <w:rPr>
+          <w:rtl w:val="0"/>
+        </w:rPr>
+      </w:r>
+    </w:p>
+    <w:p>
+      <w:pPr>
+        <w:rPr/>
+      </w:pPr>
+      <w:r>
+        <w:rPr>
+          <w:rtl w:val="0"/>
+        </w:rPr>
+      </w:r>
+    </w:p>
+    <w:p>
+      <w:pPr>
+        <w:rPr>
+          <w:b w:val="1"/>
+          <w:bCs w:val="1"/>
+        </w:rPr>
+      </w:pPr>
+      <w:r>
+        <w:rPr>
+          <w:b w:val="1"/>
+          <w:bCs w:val="1"/>
           <w:rtl w:val="0"/>
         </w:rPr>
         <w:t xml:space="preserve">Other Info (mostly notes for myself):</w:t>
@@ -1694,6 +1585,7 @@
       <w:r>
         <w:rPr>
           <w:b w:val="1"/>
+          <w:bCs w:val="1"/>
           <w:rtl w:val="0"/>
         </w:rPr>
         <w:t xml:space="preserve">sudo docker exec sql-server_EV-charger mysqldump --no-tablespaces -uuser -ppassword db_EV-charger &gt; db_EV-charger.sql</w:t>
@@ -1725,6 +1617,7 @@
       <w:r>
         <w:rPr>
           <w:b w:val="1"/>
+          <w:bCs w:val="1"/>
           <w:rtl w:val="0"/>
         </w:rPr>
         <w:t xml:space="preserve">--no-tablespaces</w:t>
@@ -1756,6 +1649,7 @@
       <w:r>
         <w:rPr>
           <w:b w:val="1"/>
+          <w:bCs w:val="1"/>
           <w:rtl w:val="0"/>
         </w:rPr>
         <w:t xml:space="preserve">user </w:t>
@@ -1769,6 +1663,7 @@
       <w:r>
         <w:rPr>
           <w:b w:val="1"/>
+          <w:bCs w:val="1"/>
           <w:rtl w:val="0"/>
         </w:rPr>
         <w:t xml:space="preserve">password </w:t>
@@ -1794,6 +1689,7 @@
       <w:r>
         <w:rPr>
           <w:b w:val="1"/>
+          <w:bCs w:val="1"/>
           <w:rtl w:val="0"/>
         </w:rPr>
         <w:t xml:space="preserve">db_EV-charger</w:t>
@@ -1819,6 +1715,7 @@
       <w:r>
         <w:rPr>
           <w:b w:val="1"/>
+          <w:bCs w:val="1"/>
           <w:rtl w:val="0"/>
         </w:rPr>
         <w:t xml:space="preserve">“&gt; db_EV-charger.sql”</w:t>
@@ -1886,6 +1783,7 @@
       <w:r>
         <w:rPr>
           <w:b w:val="1"/>
+          <w:bCs w:val="1"/>
           <w:rtl w:val="0"/>
         </w:rPr>
         <w:t xml:space="preserve">- ./init/db_EV-charger.sql:/docker-entrypoint-initdb.d/db_EV-charger.sql:ro</w:t>
@@ -1953,6 +1851,7 @@
       <w:r>
         <w:rPr>
           <w:b w:val="1"/>
+          <w:bCs w:val="1"/>
           <w:rtl w:val="0"/>
         </w:rPr>
         <w:t xml:space="preserve">sudo docker cp wordpress_EV-charger:/var/www/html ./wordpressData/EV-charger</w:t>
@@ -1984,6 +1883,7 @@
       <w:r>
         <w:rPr>
           <w:b w:val="1"/>
+          <w:bCs w:val="1"/>
           <w:rtl w:val="0"/>
         </w:rPr>
         <w:t xml:space="preserve">- /home/kali/Desktop/TEST/wordpressData/EV-charger:/var/www/html</w:t>
@@ -2015,6 +1915,7 @@
       <w:r>
         <w:rPr>
           <w:b w:val="1"/>
+          <w:bCs w:val="1"/>
           <w:rtl w:val="0"/>
         </w:rPr>
         <w:t xml:space="preserve">/html/</w:t>
@@ -2456,14 +2357,18 @@
       <w:pPr>
         <w:rPr>
           <w:b w:val="1"/>
+          <w:bCs w:val="1"/>
           <w:i w:val="1"/>
+          <w:iCs w:val="1"/>
           <w:u w:val="single"/>
         </w:rPr>
       </w:pPr>
       <w:r>
         <w:rPr>
           <w:b w:val="1"/>
+          <w:bCs w:val="1"/>
           <w:i w:val="1"/>
+          <w:iCs w:val="1"/>
           <w:u w:val="single"/>
           <w:rtl w:val="0"/>
         </w:rPr>
@@ -2479,11 +2384,13 @@
         <w:ind w:left="1440" w:hanging="360"/>
         <w:rPr>
           <w:b w:val="1"/>
-        </w:rPr>
-      </w:pPr>
-      <w:r>
-        <w:rPr>
-          <w:b w:val="1"/>
+          <w:bCs w:val="1"/>
+        </w:rPr>
+      </w:pPr>
+      <w:r>
+        <w:rPr>
+          <w:b w:val="1"/>
+          <w:bCs w:val="1"/>
           <w:rtl w:val="0"/>
         </w:rPr>
         <w:t xml:space="preserve">sudo nano docker-compose.yaml</w:t>
@@ -2513,11 +2420,13 @@
         <w:ind w:left="1440" w:hanging="360"/>
         <w:rPr>
           <w:b w:val="1"/>
-        </w:rPr>
-      </w:pPr>
-      <w:r>
-        <w:rPr>
-          <w:b w:val="1"/>
+          <w:bCs w:val="1"/>
+        </w:rPr>
+      </w:pPr>
+      <w:r>
+        <w:rPr>
+          <w:b w:val="1"/>
+          <w:bCs w:val="1"/>
           <w:rtl w:val="0"/>
         </w:rPr>
         <w:t xml:space="preserve">sudo docker compose up -d</w:t>
@@ -2547,11 +2456,13 @@
         <w:ind w:left="2160" w:hanging="360"/>
         <w:rPr>
           <w:b w:val="1"/>
-        </w:rPr>
-      </w:pPr>
-      <w:r>
-        <w:rPr>
-          <w:b w:val="1"/>
+          <w:bCs w:val="1"/>
+        </w:rPr>
+      </w:pPr>
+      <w:r>
+        <w:rPr>
+          <w:b w:val="1"/>
+          <w:bCs w:val="1"/>
           <w:rtl w:val="0"/>
         </w:rPr>
         <w:t xml:space="preserve">sudo docker compose up -d --remove-orphans</w:t>
@@ -2613,11 +2524,13 @@
         <w:ind w:left="1440" w:hanging="360"/>
         <w:rPr>
           <w:b w:val="1"/>
-        </w:rPr>
-      </w:pPr>
-      <w:r>
-        <w:rPr>
-          <w:b w:val="1"/>
+          <w:bCs w:val="1"/>
+        </w:rPr>
+      </w:pPr>
+      <w:r>
+        <w:rPr>
+          <w:b w:val="1"/>
+          <w:bCs w:val="1"/>
           <w:rtl w:val="0"/>
         </w:rPr>
         <w:t xml:space="preserve">sudo docker compose stop</w:t>
@@ -2658,6 +2571,7 @@
       <w:r>
         <w:rPr>
           <w:b w:val="1"/>
+          <w:bCs w:val="1"/>
           <w:rtl w:val="0"/>
         </w:rPr>
         <w:t xml:space="preserve">sudo docker compose down </w:t>
@@ -2678,11 +2592,13 @@
         <w:ind w:left="2880" w:hanging="360"/>
         <w:rPr>
           <w:b w:val="1"/>
-        </w:rPr>
-      </w:pPr>
-      <w:r>
-        <w:rPr>
-          <w:b w:val="1"/>
+          <w:bCs w:val="1"/>
+        </w:rPr>
+      </w:pPr>
+      <w:r>
+        <w:rPr>
+          <w:b w:val="1"/>
+          <w:bCs w:val="1"/>
           <w:rtl w:val="0"/>
         </w:rPr>
         <w:t xml:space="preserve">sudo docker compose down -v</w:t>
@@ -2703,11 +2619,13 @@
         <w:ind w:left="1440" w:hanging="360"/>
         <w:rPr>
           <w:b w:val="1"/>
-        </w:rPr>
-      </w:pPr>
-      <w:r>
-        <w:rPr>
-          <w:b w:val="1"/>
+          <w:bCs w:val="1"/>
+        </w:rPr>
+      </w:pPr>
+      <w:r>
+        <w:rPr>
+          <w:b w:val="1"/>
+          <w:bCs w:val="1"/>
           <w:rtl w:val="0"/>
         </w:rPr>
         <w:t xml:space="preserve">sudo docker compose exec -it [name of container] bash</w:t>
@@ -2738,11 +2656,13 @@
         <w:ind w:left="1440" w:hanging="360"/>
         <w:rPr>
           <w:b w:val="1"/>
-        </w:rPr>
-      </w:pPr>
-      <w:r>
-        <w:rPr>
-          <w:b w:val="1"/>
+          <w:bCs w:val="1"/>
+        </w:rPr>
+      </w:pPr>
+      <w:r>
+        <w:rPr>
+          <w:b w:val="1"/>
+          <w:bCs w:val="1"/>
           <w:rtl w:val="0"/>
         </w:rPr>
         <w:t xml:space="preserve">sudo docker compose logs [name of container]</w:t>
@@ -2784,11 +2704,13 @@
         <w:ind w:left="1440" w:hanging="360"/>
         <w:rPr>
           <w:b w:val="1"/>
-        </w:rPr>
-      </w:pPr>
-      <w:r>
-        <w:rPr>
-          <w:b w:val="1"/>
+          <w:bCs w:val="1"/>
+        </w:rPr>
+      </w:pPr>
+      <w:r>
+        <w:rPr>
+          <w:b w:val="1"/>
+          <w:bCs w:val="1"/>
           <w:rtl w:val="0"/>
         </w:rPr>
         <w:t xml:space="preserve">sudo docker ps -a</w:t>
@@ -2818,11 +2740,13 @@
         <w:ind w:left="2160" w:hanging="360"/>
         <w:rPr>
           <w:b w:val="1"/>
-        </w:rPr>
-      </w:pPr>
-      <w:r>
-        <w:rPr>
-          <w:b w:val="1"/>
+          <w:bCs w:val="1"/>
+        </w:rPr>
+      </w:pPr>
+      <w:r>
+        <w:rPr>
+          <w:b w:val="1"/>
+          <w:bCs w:val="1"/>
           <w:rtl w:val="0"/>
         </w:rPr>
         <w:t xml:space="preserve">sudo docker rm [container name/id]</w:t>
@@ -2852,11 +2776,13 @@
         <w:ind w:left="1440" w:hanging="360"/>
         <w:rPr>
           <w:b w:val="1"/>
-        </w:rPr>
-      </w:pPr>
-      <w:r>
-        <w:rPr>
-          <w:b w:val="1"/>
+          <w:bCs w:val="1"/>
+        </w:rPr>
+      </w:pPr>
+      <w:r>
+        <w:rPr>
+          <w:b w:val="1"/>
+          <w:bCs w:val="1"/>
           <w:rtl w:val="0"/>
         </w:rPr>
         <w:t xml:space="preserve">sudo docker image ls</w:t>
@@ -2886,11 +2812,13 @@
         <w:ind w:left="2160" w:hanging="360"/>
         <w:rPr>
           <w:b w:val="1"/>
-        </w:rPr>
-      </w:pPr>
-      <w:r>
-        <w:rPr>
-          <w:b w:val="1"/>
+          <w:bCs w:val="1"/>
+        </w:rPr>
+      </w:pPr>
+      <w:r>
+        <w:rPr>
+          <w:b w:val="1"/>
+          <w:bCs w:val="1"/>
           <w:rtl w:val="0"/>
         </w:rPr>
         <w:t xml:space="preserve">sudo docker image rm [image name/id]</w:t>
@@ -2920,11 +2848,13 @@
         <w:ind w:left="1440" w:hanging="360"/>
         <w:rPr>
           <w:b w:val="1"/>
-        </w:rPr>
-      </w:pPr>
-      <w:r>
-        <w:rPr>
-          <w:b w:val="1"/>
+          <w:bCs w:val="1"/>
+        </w:rPr>
+      </w:pPr>
+      <w:r>
+        <w:rPr>
+          <w:b w:val="1"/>
+          <w:bCs w:val="1"/>
           <w:rtl w:val="0"/>
         </w:rPr>
         <w:t xml:space="preserve">sudo docker volume ls/rm</w:t>
@@ -2957,11 +2887,13 @@
         <w:ind w:left="1440" w:hanging="360"/>
         <w:rPr>
           <w:b w:val="1"/>
-        </w:rPr>
-      </w:pPr>
-      <w:r>
-        <w:rPr>
-          <w:b w:val="1"/>
+          <w:bCs w:val="1"/>
+        </w:rPr>
+      </w:pPr>
+      <w:r>
+        <w:rPr>
+          <w:b w:val="1"/>
+          <w:bCs w:val="1"/>
           <w:rtl w:val="0"/>
         </w:rPr>
         <w:t xml:space="preserve">sudo docker cp [container]:/path1/file1 /path2/file2</w:t>
@@ -3035,6 +2967,7 @@
         <w:ind w:left="1440" w:hanging="360"/>
         <w:rPr>
           <w:b w:val="1"/>
+          <w:bCs w:val="1"/>
           <w:sz w:val="24"/>
           <w:szCs w:val="24"/>
         </w:rPr>
@@ -3042,6 +2975,7 @@
       <w:r>
         <w:rPr>
           <w:b w:val="1"/>
+          <w:bCs w:val="1"/>
           <w:color w:val="1f1f1f"/>
           <w:highlight w:val="white"/>
           <w:rtl w:val="0"/>
@@ -3079,6 +3013,7 @@
         <w:ind w:left="1440" w:hanging="360"/>
         <w:rPr>
           <w:b w:val="1"/>
+          <w:bCs w:val="1"/>
           <w:color w:val="1f1f1f"/>
           <w:highlight w:val="white"/>
         </w:rPr>
@@ -3086,6 +3021,7 @@
       <w:r>
         <w:rPr>
           <w:b w:val="1"/>
+          <w:bCs w:val="1"/>
           <w:color w:val="1f1f1f"/>
           <w:highlight w:val="white"/>
           <w:rtl w:val="0"/>
@@ -3102,6 +3038,7 @@
         <w:ind w:left="2160" w:hanging="360"/>
         <w:rPr>
           <w:b w:val="1"/>
+          <w:bCs w:val="1"/>
           <w:color w:val="1f1f1f"/>
           <w:highlight w:val="white"/>
         </w:rPr>
@@ -3109,6 +3046,7 @@
       <w:r>
         <w:rPr>
           <w:b w:val="1"/>
+          <w:bCs w:val="1"/>
           <w:color w:val="1f1f1f"/>
           <w:highlight w:val="white"/>
           <w:rtl w:val="0"/>
@@ -3155,6 +3093,7 @@
         <w:ind w:left="2160" w:hanging="360"/>
         <w:rPr>
           <w:b w:val="1"/>
+          <w:bCs w:val="1"/>
           <w:color w:val="1f1f1f"/>
           <w:highlight w:val="white"/>
           <w:u w:val="none"/>
@@ -3163,6 +3102,7 @@
       <w:r>
         <w:rPr>
           <w:b w:val="1"/>
+          <w:bCs w:val="1"/>
           <w:color w:val="1f1f1f"/>
           <w:highlight w:val="white"/>
           <w:rtl w:val="0"/>
@@ -3209,6 +3149,7 @@
         <w:ind w:left="2160" w:hanging="360"/>
         <w:rPr>
           <w:b w:val="1"/>
+          <w:bCs w:val="1"/>
           <w:color w:val="1f1f1f"/>
           <w:highlight w:val="white"/>
         </w:rPr>
@@ -3216,6 +3157,7 @@
       <w:r>
         <w:rPr>
           <w:b w:val="1"/>
+          <w:bCs w:val="1"/>
           <w:color w:val="1f1f1f"/>
           <w:highlight w:val="white"/>
           <w:rtl w:val="0"/>
@@ -3253,6 +3195,7 @@
         <w:ind w:left="2160" w:hanging="360"/>
         <w:rPr>
           <w:b w:val="1"/>
+          <w:bCs w:val="1"/>
           <w:color w:val="1f1f1f"/>
           <w:highlight w:val="white"/>
         </w:rPr>
@@ -3260,6 +3203,7 @@
       <w:r>
         <w:rPr>
           <w:b w:val="1"/>
+          <w:bCs w:val="1"/>
           <w:color w:val="1f1f1f"/>
           <w:highlight w:val="white"/>
           <w:rtl w:val="0"/>
@@ -3292,6 +3236,114 @@
           <w:rtl w:val="0"/>
         </w:rPr>
         <w:t xml:space="preserve">See the contents of a table, also useful for troubleshooting.</w:t>
+      </w:r>
+    </w:p>
+    <w:p>
+      <w:pPr>
+        <w:numPr>
+          <w:ilvl w:val="1"/>
+          <w:numId w:val="4"/>
+        </w:numPr>
+        <w:ind w:left="1440" w:hanging="360"/>
+        <w:rPr>
+          <w:b w:val="1"/>
+          <w:bCs w:val="1"/>
+          <w:color w:val="1f1f1f"/>
+          <w:highlight w:val="white"/>
+        </w:rPr>
+      </w:pPr>
+      <w:r>
+        <w:rPr>
+          <w:b w:val="1"/>
+          <w:bCs w:val="1"/>
+          <w:color w:val="1f1f1f"/>
+          <w:highlight w:val="white"/>
+          <w:rtl w:val="0"/>
+        </w:rPr>
+        <w:t xml:space="preserve">sqlite3 [.db file name]</w:t>
+      </w:r>
+    </w:p>
+    <w:p>
+      <w:pPr>
+        <w:numPr>
+          <w:ilvl w:val="2"/>
+          <w:numId w:val="4"/>
+        </w:numPr>
+        <w:ind w:left="2160" w:hanging="360"/>
+        <w:rPr>
+          <w:color w:val="1f1f1f"/>
+          <w:highlight w:val="white"/>
+        </w:rPr>
+      </w:pPr>
+      <w:r>
+        <w:rPr>
+          <w:color w:val="1f1f1f"/>
+          <w:highlight w:val="white"/>
+          <w:rtl w:val="0"/>
+        </w:rPr>
+        <w:t xml:space="preserve">Used for viewing the contents of a .db file in a container.</w:t>
+      </w:r>
+    </w:p>
+    <w:p>
+      <w:pPr>
+        <w:numPr>
+          <w:ilvl w:val="2"/>
+          <w:numId w:val="4"/>
+        </w:numPr>
+        <w:ind w:left="2160" w:hanging="360"/>
+        <w:rPr>
+          <w:color w:val="1f1f1f"/>
+          <w:highlight w:val="white"/>
+          <w:u w:val="none"/>
+        </w:rPr>
+      </w:pPr>
+      <w:r>
+        <w:rPr>
+          <w:color w:val="1f1f1f"/>
+          <w:highlight w:val="white"/>
+          <w:rtl w:val="0"/>
+        </w:rPr>
+        <w:t xml:space="preserve">Can use </w:t>
+      </w:r>
+      <w:r>
+        <w:rPr>
+          <w:b w:val="1"/>
+          <w:bCs w:val="1"/>
+          <w:color w:val="1f1f1f"/>
+          <w:highlight w:val="white"/>
+          <w:rtl w:val="0"/>
+        </w:rPr>
+        <w:t xml:space="preserve">.tables</w:t>
+      </w:r>
+      <w:r>
+        <w:rPr>
+          <w:color w:val="1f1f1f"/>
+          <w:highlight w:val="white"/>
+          <w:rtl w:val="0"/>
+        </w:rPr>
+        <w:t xml:space="preserve"> to view the tables within the .db file.</w:t>
+      </w:r>
+    </w:p>
+    <w:p>
+      <w:pPr>
+        <w:numPr>
+          <w:ilvl w:val="2"/>
+          <w:numId w:val="4"/>
+        </w:numPr>
+        <w:ind w:left="2160" w:hanging="360"/>
+        <w:rPr>
+          <w:color w:val="1f1f1f"/>
+          <w:highlight w:val="white"/>
+          <w:u w:val="none"/>
+        </w:rPr>
+      </w:pPr>
+      <w:r>
+        <w:rPr>
+          <w:color w:val="1f1f1f"/>
+          <w:highlight w:val="white"/>
+          <w:rtl w:val="0"/>
+        </w:rPr>
+        <w:t xml:space="preserve">Use regular SQL commands (with a semicolon at the end!) to view data.</w:t>
       </w:r>
       <w:r>
         <w:rPr>
@@ -3782,11 +3834,19 @@
       </w:pPr>
     </w:pPrDefault>
   </w:docDefaults>
+  <w:style w:type="table" w:styleId="TableNormal" w:default="1">
+    <w:name w:val="TableNormal"/>
+    <w:tblPr>
+      <w:tblCellMar>
+        <w:top w:w="100.0" w:type="dxa"/>
+        <w:left w:w="100.0" w:type="dxa"/>
+        <w:bottom w:w="100.0" w:type="dxa"/>
+        <w:right w:w="100.0" w:type="dxa"/>
+      </w:tblCellMar>
+    </w:tblPr>
+  </w:style>
   <w:style w:type="paragraph" w:styleId="Normal" w:default="1">
     <w:name w:val="normal"/>
-  </w:style>
-  <w:style w:type="table" w:styleId="TableNormal" w:default="1">
-    <w:name w:val="TableNormal"/>
   </w:style>
   <w:style w:type="paragraph" w:styleId="Heading1">
     <w:name w:val="heading 1"/>
@@ -3815,6 +3875,7 @@
     </w:pPr>
     <w:rPr>
       <w:b w:val="0"/>
+      <w:bCs w:val="0"/>
       <w:sz w:val="32"/>
       <w:szCs w:val="32"/>
     </w:rPr>
@@ -3831,6 +3892,7 @@
     </w:pPr>
     <w:rPr>
       <w:b w:val="0"/>
+      <w:bCs w:val="0"/>
       <w:color w:val="434343"/>
       <w:sz w:val="28"/>
       <w:szCs w:val="28"/>
@@ -3880,6 +3942,7 @@
     </w:pPr>
     <w:rPr>
       <w:i w:val="1"/>
+      <w:iCs w:val="1"/>
       <w:color w:val="666666"/>
       <w:sz w:val="22"/>
       <w:szCs w:val="22"/>
@@ -3913,6 +3976,7 @@
     <w:rPr>
       <w:rFonts w:ascii="Arial" w:cs="Arial" w:eastAsia="Arial" w:hAnsi="Arial"/>
       <w:i w:val="0"/>
+      <w:iCs w:val="0"/>
       <w:color w:val="666666"/>
       <w:sz w:val="30"/>
       <w:szCs w:val="30"/>

</xml_diff>

<commit_message>
Forgot to set an absolute path for the docker compose file, so fixed that + updated documentation to mention the need to cd into GamifiedICS/ after the setup script is done running (without that, 'docker compose up/stop' won't work unless you specify the path manually).
</commit_message>
<xml_diff>
--- a/Backend/VM Setup/VM Setup Guide.docx
+++ b/Backend/VM Setup/VM Setup Guide.docx
@@ -416,6 +416,38 @@
           <w:rtl w:val="0"/>
         </w:rPr>
         <w:t xml:space="preserve">This will run the startup script and do the rest. It will take a few minutes.</w:t>
+      </w:r>
+    </w:p>
+    <w:p>
+      <w:pPr>
+        <w:numPr>
+          <w:ilvl w:val="1"/>
+          <w:numId w:val="1"/>
+        </w:numPr>
+        <w:ind w:left="1440" w:hanging="360"/>
+        <w:rPr>
+          <w:u w:val="none"/>
+        </w:rPr>
+      </w:pPr>
+      <w:r>
+        <w:rPr>
+          <w:rtl w:val="0"/>
+        </w:rPr>
+        <w:t xml:space="preserve">Once that’s done, do </w:t>
+      </w:r>
+      <w:r>
+        <w:rPr>
+          <w:b w:val="1"/>
+          <w:bCs w:val="1"/>
+          <w:rtl w:val="0"/>
+        </w:rPr>
+        <w:t xml:space="preserve">cd GamifiedICS</w:t>
+      </w:r>
+      <w:r>
+        <w:rPr>
+          <w:rtl w:val="0"/>
+        </w:rPr>
+        <w:t xml:space="preserve">.</w:t>
       </w:r>
     </w:p>
     <w:p>

</xml_diff>